<commit_message>
Update OMEN whitepaper to v0.2
</commit_message>
<xml_diff>
--- a/papers/OMEN_whitepaper.docx
+++ b/papers/OMEN_whitepaper.docx
@@ -78,7 +78,39 @@
           <w:sz w:val="20"/>
           <w:szCs w:val="20"/>
         </w:rPr>
-        <w:t xml:space="preserve">AbleVLabs</w:t>
+        <w:t xml:space="preserve">Independent Researcher</w:t>
+      </w:r>
+    </w:p>
+    <w:p>
+      <w:pPr>
+        <w:spacing w:before="140"/>
+        <w:jc w:val="center"/>
+      </w:pPr>
+      <w:r>
+        <w:rPr>
+          <w:rFonts w:ascii="Calibri" w:cs="Calibri" w:eastAsia="Calibri" w:hAnsi="Calibri"/>
+          <w:color w:val="5a5a5a"/>
+          <w:sz w:val="17"/>
+          <w:szCs w:val="17"/>
+        </w:rPr>
+        <w:t xml:space="preserve">Correspondence: research@ablevlabs.com   ·   ORCID: 0009-0001-0178-7752</w:t>
+      </w:r>
+    </w:p>
+    <w:p>
+      <w:pPr>
+        <w:spacing w:before="200"/>
+        <w:jc w:val="center"/>
+      </w:pPr>
+      <w:r>
+        <w:rPr>
+          <w:rFonts w:ascii="Calibri" w:cs="Calibri" w:eastAsia="Calibri" w:hAnsi="Calibri"/>
+          <w:i/>
+          <w:iCs/>
+          <w:color w:val="5a5a5a"/>
+          <w:sz w:val="17"/>
+          <w:szCs w:val="17"/>
+        </w:rPr>
+        <w:t xml:space="preserve">This manuscript is a preprint and has NOT been peer reviewed.</w:t>
       </w:r>
     </w:p>
     <w:p>
@@ -93,7 +125,7 @@
           <w:sz w:val="18"/>
           <w:szCs w:val="18"/>
         </w:rPr>
-        <w:t xml:space="preserve">Proposal / Working Draft  ·  Standard version 0.1  ·  August 2026</w:t>
+        <w:t xml:space="preserve">Preprint  ·  Standard version 0.2  ·  September 2026</w:t>
       </w:r>
     </w:p>
     <w:p>
@@ -150,7 +182,107 @@
           <w:sz w:val="21"/>
           <w:szCs w:val="21"/>
         </w:rPr>
-        <w:t xml:space="preserve"> (Open Movement &amp; Exercise Nomenclature): a generative naming standard that describes a movement as a bundle of orthogonal facets, derives its target musculature from its movement pattern rather than treating muscle as an input, and produces two deterministic outputs: a human-readable canonical string and a short, stable, language-neutral identifier suitable as a database primary key. OMEN separates three layers that existing systems conflate (the structured facet record, the canonical identifier, and the curated display name), the same separation that let systematic naming succeed in chemistry (SMILES, InChI) and clinical terminology (SNOMED CT). We give the facet schema and its controlled vocabularies, a fixed serialization order, a defaults mechanism that keeps everyday names short, a governance and versioning model, and an evaluation protocol centered on inter-annotator agreement. A working reference encoder and test suite accompany the standard; every canonical string and identifier in this paper is produced by that implementation.</w:t>
+        <w:t xml:space="preserve"> (Open Movement &amp; Exercise Nomenclature): a generative naming standard that describes a movement as a bundle of orthogonal facets, derives its target musculature from its movement pattern rather than treating muscle as an input, and produces two deterministic outputs: a human-readable canonical string and a short, stable, language-neutral identifier suitable as a database primary key. OMEN separates three layers that existing systems conflate (the structured facet record, the canonical identifier, and the curated display name), the same separation that let systematic naming succeed in chemistry (SMILES, InChI) and clinical terminology (SNOMED CT). We give the facet schema and its controlled vocabularies, a fixed serialization order, a defaults mechanism that keeps everyday names short, a governance and versioning model, and an evaluation protocol centered on inter-annotator agreement. A working reference encoder and test suite accompany the standard; every canonical string and identifier in this paper is produced by that implementation. We also report an evaluation against two independent public databases. Of 678 resistance-training records in the Free Exercise DB, </w:t>
+      </w:r>
+      <w:r>
+        <w:rPr>
+          <w:rFonts w:ascii="Georgia" w:cs="Georgia" w:eastAsia="Georgia" w:hAnsi="Georgia"/>
+          <w:b/>
+          <w:bCs/>
+          <w:color w:val="1a1a1a"/>
+          <w:sz w:val="21"/>
+          <w:szCs w:val="21"/>
+        </w:rPr>
+        <w:t xml:space="preserve">84.7%</w:t>
+      </w:r>
+      <w:r>
+        <w:rPr>
+          <w:rFonts w:ascii="Georgia" w:cs="Georgia" w:eastAsia="Georgia" w:hAnsi="Georgia"/>
+          <w:color w:val="1a1a1a"/>
+          <w:sz w:val="21"/>
+          <w:szCs w:val="21"/>
+        </w:rPr>
+        <w:t xml:space="preserve"> are expressible without inventing a term (</w:t>
+      </w:r>
+      <w:r>
+        <w:rPr>
+          <w:rFonts w:ascii="Georgia" w:cs="Georgia" w:eastAsia="Georgia" w:hAnsi="Georgia"/>
+          <w:b/>
+          <w:bCs/>
+          <w:color w:val="1a1a1a"/>
+          <w:sz w:val="21"/>
+          <w:szCs w:val="21"/>
+        </w:rPr>
+        <w:t xml:space="preserve">91.4%</w:t>
+      </w:r>
+      <w:r>
+        <w:rPr>
+          <w:rFonts w:ascii="Georgia" w:cs="Georgia" w:eastAsia="Georgia" w:hAnsi="Georgia"/>
+          <w:color w:val="1a1a1a"/>
+          <w:sz w:val="21"/>
+          <w:szCs w:val="21"/>
+        </w:rPr>
+        <w:t xml:space="preserve"> of those whose own fields disclose enough to encode at all); on a second corpus, wger, only </w:t>
+      </w:r>
+      <w:r>
+        <w:rPr>
+          <w:rFonts w:ascii="Georgia" w:cs="Georgia" w:eastAsia="Georgia" w:hAnsi="Georgia"/>
+          <w:b/>
+          <w:bCs/>
+          <w:color w:val="1a1a1a"/>
+          <w:sz w:val="21"/>
+          <w:szCs w:val="21"/>
+        </w:rPr>
+        <w:t xml:space="preserve">1.9%</w:t>
+      </w:r>
+      <w:r>
+        <w:rPr>
+          <w:rFonts w:ascii="Georgia" w:cs="Georgia" w:eastAsia="Georgia" w:hAnsi="Georgia"/>
+          <w:color w:val="1a1a1a"/>
+          <w:sz w:val="21"/>
+          <w:szCs w:val="21"/>
+        </w:rPr>
+        <w:t xml:space="preserve"> of records require a term the standard lacks. The residual gap in both corpora is a single principled category, the multi-phase Olympic lifts. 574 distinct source names collapse to 304 keys, exposing synonymy directly; </w:t>
+      </w:r>
+      <w:r>
+        <w:rPr>
+          <w:rFonts w:ascii="Georgia" w:cs="Georgia" w:eastAsia="Georgia" w:hAnsi="Georgia"/>
+          <w:b/>
+          <w:bCs/>
+          <w:color w:val="1a1a1a"/>
+          <w:sz w:val="21"/>
+          <w:szCs w:val="21"/>
+        </w:rPr>
+        <w:t xml:space="preserve">81%</w:t>
+      </w:r>
+      <w:r>
+        <w:rPr>
+          <w:rFonts w:ascii="Georgia" w:cs="Georgia" w:eastAsia="Georgia" w:hAnsi="Georgia"/>
+          <w:color w:val="1a1a1a"/>
+          <w:sz w:val="21"/>
+          <w:szCs w:val="21"/>
+        </w:rPr>
+        <w:t xml:space="preserve"> of those names never state posture; and no key collision occurs across </w:t>
+      </w:r>
+      <w:r>
+        <w:rPr>
+          <w:rFonts w:ascii="Georgia" w:cs="Georgia" w:eastAsia="Georgia" w:hAnsi="Georgia"/>
+          <w:b/>
+          <w:bCs/>
+          <w:color w:val="1a1a1a"/>
+          <w:sz w:val="21"/>
+          <w:szCs w:val="21"/>
+        </w:rPr>
+        <w:t xml:space="preserve">6,054,048</w:t>
+      </w:r>
+      <w:r>
+        <w:rPr>
+          <w:rFonts w:ascii="Georgia" w:cs="Georgia" w:eastAsia="Georgia" w:hAnsi="Georgia"/>
+          <w:color w:val="1a1a1a"/>
+          <w:sz w:val="21"/>
+          <w:szCs w:val="21"/>
+        </w:rPr>
+        <w:t xml:space="preserve"> generated records. A crosswalk mapping every audited record to its key is released with the standard. The inter-annotator study on which a naming standard ultimately rests is specified, with its materials published, but has not been run.</w:t>
       </w:r>
     </w:p>
     <w:p>
@@ -200,25 +332,216 @@
         <w:t xml:space="preserve">Contents</w:t>
       </w:r>
     </w:p>
-    <w:sdt>
-      <w:sdtPr>
-        <w:alias w:val="Contents"/>
-      </w:sdtPr>
-      <w:sdtContent>
-        <w:p>
-          <w:r>
-            <w:fldChar w:fldCharType="begin" w:dirty="true"/>
-            <w:instrText xml:space="preserve">TOC \h \o "1-2"</w:instrText>
-            <w:fldChar w:fldCharType="separate"/>
-          </w:r>
-        </w:p>
-        <w:p>
-          <w:r>
-            <w:fldChar w:fldCharType="end"/>
-          </w:r>
-        </w:p>
-      </w:sdtContent>
-    </w:sdt>
+    <w:p>
+      <w:pPr>
+        <w:spacing w:after="60"/>
+        <w:ind w:left="240"/>
+      </w:pPr>
+      <w:r>
+        <w:rPr>
+          <w:rFonts w:ascii="Calibri" w:cs="Calibri" w:eastAsia="Calibri" w:hAnsi="Calibri"/>
+          <w:color w:val="1a1a1a"/>
+          <w:sz w:val="20"/>
+          <w:szCs w:val="20"/>
+        </w:rPr>
+        <w:t xml:space="preserve">1.  Introduction</w:t>
+      </w:r>
+    </w:p>
+    <w:p>
+      <w:pPr>
+        <w:spacing w:after="60"/>
+        <w:ind w:left="240"/>
+      </w:pPr>
+      <w:r>
+        <w:rPr>
+          <w:rFonts w:ascii="Calibri" w:cs="Calibri" w:eastAsia="Calibri" w:hAnsi="Calibri"/>
+          <w:color w:val="1a1a1a"/>
+          <w:sz w:val="20"/>
+          <w:szCs w:val="20"/>
+        </w:rPr>
+        <w:t xml:space="preserve">2.  Background and Related Work</w:t>
+      </w:r>
+    </w:p>
+    <w:p>
+      <w:pPr>
+        <w:spacing w:after="60"/>
+        <w:ind w:left="240"/>
+      </w:pPr>
+      <w:r>
+        <w:rPr>
+          <w:rFonts w:ascii="Calibri" w:cs="Calibri" w:eastAsia="Calibri" w:hAnsi="Calibri"/>
+          <w:color w:val="1a1a1a"/>
+          <w:sz w:val="20"/>
+          <w:szCs w:val="20"/>
+        </w:rPr>
+        <w:t xml:space="preserve">3.  Design Principles</w:t>
+      </w:r>
+    </w:p>
+    <w:p>
+      <w:pPr>
+        <w:spacing w:after="60"/>
+        <w:ind w:left="240"/>
+      </w:pPr>
+      <w:r>
+        <w:rPr>
+          <w:rFonts w:ascii="Calibri" w:cs="Calibri" w:eastAsia="Calibri" w:hAnsi="Calibri"/>
+          <w:color w:val="1a1a1a"/>
+          <w:sz w:val="20"/>
+          <w:szCs w:val="20"/>
+        </w:rPr>
+        <w:t xml:space="preserve">4.  The OMEN Model</w:t>
+      </w:r>
+    </w:p>
+    <w:p>
+      <w:pPr>
+        <w:spacing w:after="60"/>
+        <w:ind w:left="240"/>
+      </w:pPr>
+      <w:r>
+        <w:rPr>
+          <w:rFonts w:ascii="Calibri" w:cs="Calibri" w:eastAsia="Calibri" w:hAnsi="Calibri"/>
+          <w:color w:val="1a1a1a"/>
+          <w:sz w:val="20"/>
+          <w:szCs w:val="20"/>
+        </w:rPr>
+        <w:t xml:space="preserve">5.  Canonical Forms and Identifiers</w:t>
+      </w:r>
+    </w:p>
+    <w:p>
+      <w:pPr>
+        <w:spacing w:after="60"/>
+        <w:ind w:left="240"/>
+      </w:pPr>
+      <w:r>
+        <w:rPr>
+          <w:rFonts w:ascii="Calibri" w:cs="Calibri" w:eastAsia="Calibri" w:hAnsi="Calibri"/>
+          <w:color w:val="1a1a1a"/>
+          <w:sz w:val="20"/>
+          <w:szCs w:val="20"/>
+        </w:rPr>
+        <w:t xml:space="preserve">6.  Worked Examples</w:t>
+      </w:r>
+    </w:p>
+    <w:p>
+      <w:pPr>
+        <w:spacing w:after="60"/>
+        <w:ind w:left="240"/>
+      </w:pPr>
+      <w:r>
+        <w:rPr>
+          <w:rFonts w:ascii="Calibri" w:cs="Calibri" w:eastAsia="Calibri" w:hAnsi="Calibri"/>
+          <w:color w:val="1a1a1a"/>
+          <w:sz w:val="20"/>
+          <w:szCs w:val="20"/>
+        </w:rPr>
+        <w:t xml:space="preserve">7.  Reference Implementation</w:t>
+      </w:r>
+    </w:p>
+    <w:p>
+      <w:pPr>
+        <w:spacing w:after="60"/>
+        <w:ind w:left="240"/>
+      </w:pPr>
+      <w:r>
+        <w:rPr>
+          <w:rFonts w:ascii="Calibri" w:cs="Calibri" w:eastAsia="Calibri" w:hAnsi="Calibri"/>
+          <w:color w:val="1a1a1a"/>
+          <w:sz w:val="20"/>
+          <w:szCs w:val="20"/>
+        </w:rPr>
+        <w:t xml:space="preserve">8.  Evaluation Protocol</w:t>
+      </w:r>
+    </w:p>
+    <w:p>
+      <w:pPr>
+        <w:spacing w:after="60"/>
+        <w:ind w:left="240"/>
+      </w:pPr>
+      <w:r>
+        <w:rPr>
+          <w:rFonts w:ascii="Calibri" w:cs="Calibri" w:eastAsia="Calibri" w:hAnsi="Calibri"/>
+          <w:color w:val="1a1a1a"/>
+          <w:sz w:val="20"/>
+          <w:szCs w:val="20"/>
+        </w:rPr>
+        <w:t xml:space="preserve">9.  Results</w:t>
+      </w:r>
+    </w:p>
+    <w:p>
+      <w:pPr>
+        <w:spacing w:after="60"/>
+        <w:ind w:left="240"/>
+      </w:pPr>
+      <w:r>
+        <w:rPr>
+          <w:rFonts w:ascii="Calibri" w:cs="Calibri" w:eastAsia="Calibri" w:hAnsi="Calibri"/>
+          <w:color w:val="1a1a1a"/>
+          <w:sz w:val="20"/>
+          <w:szCs w:val="20"/>
+        </w:rPr>
+        <w:t xml:space="preserve">10.  Governance and Versioning</w:t>
+      </w:r>
+    </w:p>
+    <w:p>
+      <w:pPr>
+        <w:spacing w:after="60"/>
+        <w:ind w:left="240"/>
+      </w:pPr>
+      <w:r>
+        <w:rPr>
+          <w:rFonts w:ascii="Calibri" w:cs="Calibri" w:eastAsia="Calibri" w:hAnsi="Calibri"/>
+          <w:color w:val="1a1a1a"/>
+          <w:sz w:val="20"/>
+          <w:szCs w:val="20"/>
+        </w:rPr>
+        <w:t xml:space="preserve">11.  Limitations and Future Work</w:t>
+      </w:r>
+    </w:p>
+    <w:p>
+      <w:pPr>
+        <w:spacing w:after="60"/>
+        <w:ind w:left="240"/>
+      </w:pPr>
+      <w:r>
+        <w:rPr>
+          <w:rFonts w:ascii="Calibri" w:cs="Calibri" w:eastAsia="Calibri" w:hAnsi="Calibri"/>
+          <w:color w:val="1a1a1a"/>
+          <w:sz w:val="20"/>
+          <w:szCs w:val="20"/>
+        </w:rPr>
+        <w:t xml:space="preserve">12.  Conclusion</w:t>
+      </w:r>
+    </w:p>
+    <w:p>
+      <w:pPr>
+        <w:spacing w:after="60"/>
+        <w:ind w:left="240"/>
+      </w:pPr>
+      <w:r>
+        <w:rPr>
+          <w:rFonts w:ascii="Calibri" w:cs="Calibri" w:eastAsia="Calibri" w:hAnsi="Calibri"/>
+          <w:color w:val="1a1a1a"/>
+          <w:sz w:val="20"/>
+          <w:szCs w:val="20"/>
+        </w:rPr>
+        <w:t xml:space="preserve">     Data and Code Availability</w:t>
+      </w:r>
+    </w:p>
+    <w:p>
+      <w:pPr>
+        <w:spacing w:after="60"/>
+        <w:ind w:left="240"/>
+      </w:pPr>
+      <w:r>
+        <w:rPr>
+          <w:rFonts w:ascii="Calibri" w:cs="Calibri" w:eastAsia="Calibri" w:hAnsi="Calibri"/>
+          <w:color w:val="1a1a1a"/>
+          <w:sz w:val="20"/>
+          <w:szCs w:val="20"/>
+        </w:rPr>
+        <w:t xml:space="preserve">     References</w:t>
+      </w:r>
+    </w:p>
     <w:p>
       <w:r>
         <w:br w:type="page"/>
@@ -1669,6 +1992,36 @@
           <w:sz w:val="21"/>
           <w:szCs w:val="21"/>
         </w:rPr>
+        <w:t xml:space="preserve">Anatomically complete.</w:t>
+      </w:r>
+      <w:r>
+        <w:rPr>
+          <w:rFonts w:ascii="Georgia" w:cs="Georgia" w:eastAsia="Georgia" w:hAnsi="Georgia"/>
+          <w:color w:val="1a1a1a"/>
+          <w:sz w:val="21"/>
+          <w:szCs w:val="21"/>
+        </w:rPr>
+        <w:t xml:space="preserve"> For every joint the standard covers, it provides the full set of that joint's actions, not only those that happen to be common in a gym. Completeness is a checkable property rather than an aspiration: for each action the vocabulary must contain its anatomical counterpart.</w:t>
+      </w:r>
+    </w:p>
+    <w:p>
+      <w:pPr>
+        <w:pStyle w:val="ListParagraph"/>
+        <w:numPr>
+          <w:ilvl w:val="0"/>
+          <w:numId w:val="1"/>
+        </w:numPr>
+        <w:spacing w:after="90" w:line="268"/>
+      </w:pPr>
+      <w:r>
+        <w:rPr>
+          <w:rFonts w:ascii="Georgia" w:cs="Georgia" w:eastAsia="Georgia" w:hAnsi="Georgia"/>
+          <w:b/>
+          <w:bCs/>
+          <w:color w:val="1a1a1a"/>
+          <w:sz w:val="21"/>
+          <w:szCs w:val="21"/>
+        </w:rPr>
         <w:t xml:space="preserve">Governed and open.</w:t>
       </w:r>
       <w:r>
@@ -1853,6 +2206,68 @@
           <w:szCs w:val="21"/>
         </w:rPr>
         <w:t xml:space="preserve"> You describe a movement by its facets, and “bench press” is the label those facets resolve to, not one of the coordinates you supply. This is what removes the redundancy and the contradictions (a record whose name says one thing and whose fields say another) that fixed-word-order schemes permit.</w:t>
+      </w:r>
+    </w:p>
+    <w:p>
+      <w:pPr>
+        <w:spacing w:after="60" w:before="140"/>
+        <w:jc w:val="center"/>
+      </w:pPr>
+      <w:r>
+        <w:drawing>
+          <wp:inline distT="0" distB="0" distL="0" distR="0">
+            <wp:extent cx="4762500" cy="3400425"/>
+            <wp:effectExtent t="0" r="0" b="0" l="0"/>
+            <wp:docPr id="1" name="" descr="" title=""/>
+            <wp:cNvGraphicFramePr>
+              <a:graphicFrameLocks xmlns:a="http://schemas.openxmlformats.org/drawingml/2006/main" noChangeAspect="1"/>
+            </wp:cNvGraphicFramePr>
+            <a:graphic xmlns:a="http://schemas.openxmlformats.org/drawingml/2006/main">
+              <a:graphicData uri="http://schemas.openxmlformats.org/drawingml/2006/picture">
+                <pic:pic xmlns:pic="http://schemas.openxmlformats.org/drawingml/2006/picture">
+                  <pic:nvPicPr>
+                    <pic:cNvPr id="0" name="" descr=""/>
+                    <pic:cNvPicPr>
+                      <a:picLocks noChangeAspect="1" noChangeArrowheads="1"/>
+                    </pic:cNvPicPr>
+                  </pic:nvPicPr>
+                  <pic:blipFill>
+                    <a:blip r:embed="rId9" cstate="none"/>
+                    <a:srcRect/>
+                    <a:stretch>
+                      <a:fillRect/>
+                    </a:stretch>
+                  </pic:blipFill>
+                  <pic:spPr bwMode="auto">
+                    <a:xfrm>
+                      <a:off x="0" y="0"/>
+                      <a:ext cx="4762500" cy="3400425"/>
+                    </a:xfrm>
+                    <a:prstGeom prst="rect">
+                      <a:avLst/>
+                    </a:prstGeom>
+                  </pic:spPr>
+                </pic:pic>
+              </a:graphicData>
+            </a:graphic>
+          </wp:inline>
+        </w:drawing>
+      </w:r>
+    </w:p>
+    <w:p>
+      <w:pPr>
+        <w:spacing w:after="180"/>
+      </w:pPr>
+      <w:r>
+        <w:rPr>
+          <w:rFonts w:ascii="Calibri" w:cs="Calibri" w:eastAsia="Calibri" w:hAnsi="Calibri"/>
+          <w:i/>
+          <w:iCs/>
+          <w:color w:val="5a5a5a"/>
+          <w:sz w:val="17"/>
+          <w:szCs w:val="17"/>
+        </w:rPr>
+        <w:t xml:space="preserve">Figure 1. The three layers OMEN keeps distinct. The facet record is authored; the canonical form and key are generated from it; the display name is a curated alias attached to the record. Conflating these layers is the characteristic failure of existing schemes.</w:t>
       </w:r>
     </w:p>
     <w:p>
@@ -3055,7 +3470,7 @@
           <w:sz w:val="17"/>
           <w:szCs w:val="17"/>
         </w:rPr>
-        <w:t xml:space="preserve">key:     OMEN-0.1-VRQRJHQSX5NX6</w:t>
+        <w:t xml:space="preserve">key:     OMEN-0.2-VRQRJHQSX5NX6</w:t>
       </w:r>
     </w:p>
     <w:p>
@@ -3079,7 +3494,7 @@
           <w:sz w:val="19"/>
           <w:szCs w:val="19"/>
         </w:rPr>
-        <w:t xml:space="preserve">OMEN-0.1-</w:t>
+        <w:t xml:space="preserve">OMEN-0.2-</w:t>
       </w:r>
       <w:r>
         <w:rPr>
@@ -3089,6 +3504,68 @@
           <w:szCs w:val="21"/>
         </w:rPr>
         <w:t xml:space="preserve">) guarantees that identifiers minted under one edition of the standard are never silently reinterpreted by another.</w:t>
+      </w:r>
+    </w:p>
+    <w:p>
+      <w:pPr>
+        <w:spacing w:after="60" w:before="140"/>
+        <w:jc w:val="center"/>
+      </w:pPr>
+      <w:r>
+        <w:drawing>
+          <wp:inline distT="0" distB="0" distL="0" distR="0">
+            <wp:extent cx="5048250" cy="2257425"/>
+            <wp:effectExtent t="0" r="0" b="0" l="0"/>
+            <wp:docPr id="1" name="" descr="" title=""/>
+            <wp:cNvGraphicFramePr>
+              <a:graphicFrameLocks xmlns:a="http://schemas.openxmlformats.org/drawingml/2006/main" noChangeAspect="1"/>
+            </wp:cNvGraphicFramePr>
+            <a:graphic xmlns:a="http://schemas.openxmlformats.org/drawingml/2006/main">
+              <a:graphicData uri="http://schemas.openxmlformats.org/drawingml/2006/picture">
+                <pic:pic xmlns:pic="http://schemas.openxmlformats.org/drawingml/2006/picture">
+                  <pic:nvPicPr>
+                    <pic:cNvPr id="0" name="" descr=""/>
+                    <pic:cNvPicPr>
+                      <a:picLocks noChangeAspect="1" noChangeArrowheads="1"/>
+                    </pic:cNvPicPr>
+                  </pic:nvPicPr>
+                  <pic:blipFill>
+                    <a:blip r:embed="rId10" cstate="none"/>
+                    <a:srcRect/>
+                    <a:stretch>
+                      <a:fillRect/>
+                    </a:stretch>
+                  </pic:blipFill>
+                  <pic:spPr bwMode="auto">
+                    <a:xfrm>
+                      <a:off x="0" y="0"/>
+                      <a:ext cx="5048250" cy="2257425"/>
+                    </a:xfrm>
+                    <a:prstGeom prst="rect">
+                      <a:avLst/>
+                    </a:prstGeom>
+                  </pic:spPr>
+                </pic:pic>
+              </a:graphicData>
+            </a:graphic>
+          </wp:inline>
+        </w:drawing>
+      </w:r>
+    </w:p>
+    <w:p>
+      <w:pPr>
+        <w:spacing w:after="180"/>
+      </w:pPr>
+      <w:r>
+        <w:rPr>
+          <w:rFonts w:ascii="Calibri" w:cs="Calibri" w:eastAsia="Calibri" w:hAnsi="Calibri"/>
+          <w:i/>
+          <w:iCs/>
+          <w:color w:val="5a5a5a"/>
+          <w:sz w:val="17"/>
+          <w:szCs w:val="17"/>
+        </w:rPr>
+        <w:t xml:space="preserve">Figure 2. The encoding pipeline. A validated facet record is expanded against its defaults, serialized in the fixed citation order to OMEN-X, and hashed with a version prefix to yield the key. Musculature and mechanic are read from the movement pattern and are never entered by hand.</w:t>
       </w:r>
     </w:p>
     <w:p>
@@ -3343,7 +3820,7 @@
                 <w:sz w:val="16"/>
                 <w:szCs w:val="16"/>
               </w:rPr>
-              <w:t xml:space="preserve">OMEN-0.1-HWYDOFIMW3MXQ</w:t>
+              <w:t xml:space="preserve">OMEN-0.2-HWYDOFIMW3MXQ</w:t>
             </w:r>
           </w:p>
         </w:tc>
@@ -3445,7 +3922,7 @@
                 <w:sz w:val="16"/>
                 <w:szCs w:val="16"/>
               </w:rPr>
-              <w:t xml:space="preserve">OMEN-0.1-VRQRJHQSX5NX6</w:t>
+              <w:t xml:space="preserve">OMEN-0.2-VRQRJHQSX5NX6</w:t>
             </w:r>
           </w:p>
         </w:tc>
@@ -3547,7 +4024,7 @@
                 <w:sz w:val="16"/>
                 <w:szCs w:val="16"/>
               </w:rPr>
-              <w:t xml:space="preserve">OMEN-0.1-CRBWWU6C4RMIK</w:t>
+              <w:t xml:space="preserve">OMEN-0.2-CRBWWU6C4RMIK</w:t>
             </w:r>
           </w:p>
         </w:tc>
@@ -3649,7 +4126,7 @@
                 <w:sz w:val="16"/>
                 <w:szCs w:val="16"/>
               </w:rPr>
-              <w:t xml:space="preserve">OMEN-0.1-L2SHL5OD62KEW</w:t>
+              <w:t xml:space="preserve">OMEN-0.2-L2SHL5OD62KEW</w:t>
             </w:r>
           </w:p>
         </w:tc>
@@ -3751,7 +4228,7 @@
                 <w:sz w:val="16"/>
                 <w:szCs w:val="16"/>
               </w:rPr>
-              <w:t xml:space="preserve">OMEN-0.1-NJJ6HLRNNFORY</w:t>
+              <w:t xml:space="preserve">OMEN-0.2-NJJ6HLRNNFORY</w:t>
             </w:r>
           </w:p>
         </w:tc>
@@ -3853,7 +4330,7 @@
                 <w:sz w:val="16"/>
                 <w:szCs w:val="16"/>
               </w:rPr>
-              <w:t xml:space="preserve">OMEN-0.1-LX2LC34DVHM4I</w:t>
+              <w:t xml:space="preserve">OMEN-0.2-LX2LC34DVHM4I</w:t>
             </w:r>
           </w:p>
         </w:tc>
@@ -3955,7 +4432,7 @@
                 <w:sz w:val="16"/>
                 <w:szCs w:val="16"/>
               </w:rPr>
-              <w:t xml:space="preserve">OMEN-0.1-K5R5GCRCMTPDE</w:t>
+              <w:t xml:space="preserve">OMEN-0.2-K5R5GCRCMTPDE</w:t>
             </w:r>
           </w:p>
         </w:tc>
@@ -4057,7 +4534,7 @@
                 <w:sz w:val="16"/>
                 <w:szCs w:val="16"/>
               </w:rPr>
-              <w:t xml:space="preserve">OMEN-0.1-R77DG3ING3F7U</w:t>
+              <w:t xml:space="preserve">OMEN-0.2-R77DG3ING3F7U</w:t>
             </w:r>
           </w:p>
         </w:tc>
@@ -4159,7 +4636,7 @@
                 <w:sz w:val="16"/>
                 <w:szCs w:val="16"/>
               </w:rPr>
-              <w:t xml:space="preserve">OMEN-0.1-6PY6ZOH7GNUNG</w:t>
+              <w:t xml:space="preserve">OMEN-0.2-6PY6ZOH7GNUNG</w:t>
             </w:r>
           </w:p>
         </w:tc>
@@ -4246,7 +4723,7 @@
         <w:t xml:space="preserve">$ python omen.py --name "chin-up"
   CHIN-UP
   OMEN-C   supinated vertical-pull
-  OMEN key OMEN-0.1-NJJ6HLRNNFORY
+  OMEN key OMEN-0.2-NJJ6HLRNNFORY
   primary muscles  latissimus-dorsi, teres-major</w:t>
       </w:r>
     </w:p>
@@ -4264,7 +4741,7 @@
           <w:sz w:val="30"/>
           <w:szCs w:val="30"/>
         </w:rPr>
-        <w:t xml:space="preserve">8. Evaluation Design</w:t>
+        <w:t xml:space="preserve">8. Evaluation Protocol</w:t>
       </w:r>
     </w:p>
     <w:p>
@@ -4279,7 +4756,7 @@
           <w:sz w:val="21"/>
           <w:szCs w:val="21"/>
         </w:rPr>
-        <w:t xml:space="preserve">A naming standard is validated less by argument than by whether people apply it the same way. We propose the following protocol; it is a plan for validation, and its metrics are the ones by which OMEN should be judged and revised.</w:t>
+        <w:t xml:space="preserve">A naming standard is validated less by argument than by whether people apply it the same way. This section specifies the protocol; Section 9 reports results for the four measures that can be computed without human subjects, and Section 11 states plainly which measure remains outstanding.</w:t>
       </w:r>
     </w:p>
     <w:p>
@@ -4446,7 +4923,1727 @@
           <w:sz w:val="30"/>
           <w:szCs w:val="30"/>
         </w:rPr>
-        <w:t xml:space="preserve">9. Governance and Versioning</w:t>
+        <w:t xml:space="preserve">9. Results</w:t>
+      </w:r>
+    </w:p>
+    <w:p>
+      <w:pPr>
+        <w:spacing w:after="140" w:line="276"/>
+        <w:jc w:val="both"/>
+      </w:pPr>
+      <w:r>
+        <w:rPr>
+          <w:rFonts w:ascii="Georgia" w:cs="Georgia" w:eastAsia="Georgia" w:hAnsi="Georgia"/>
+          <w:color w:val="1a1a1a"/>
+          <w:sz w:val="21"/>
+          <w:szCs w:val="21"/>
+        </w:rPr>
+        <w:t xml:space="preserve">The protocol of Section 8 has been executed in part. Coverage and backward-compatibility were measured against two independent databases, and collision resistance over a generated cross-product of the vocabularies. The inter-annotator study was not run; its materials are published with the standard and it remains the principal item of future work. Every number below is produced by the reference encoder and the audit scripts released with it.</w:t>
+      </w:r>
+    </w:p>
+    <w:p>
+      <w:pPr>
+        <w:pStyle w:val="Heading2"/>
+        <w:spacing w:after="100" w:before="220"/>
+      </w:pPr>
+      <w:r>
+        <w:rPr>
+          <w:rFonts w:ascii="Calibri" w:cs="Calibri" w:eastAsia="Calibri" w:hAnsi="Calibri"/>
+          <w:b/>
+          <w:bCs/>
+          <w:color w:val="1a1a1a"/>
+          <w:sz w:val="24"/>
+          <w:szCs w:val="24"/>
+        </w:rPr>
+        <w:t xml:space="preserve">9.1 Coverage against two independent databases</w:t>
+      </w:r>
+    </w:p>
+    <w:p>
+      <w:pPr>
+        <w:spacing w:after="140" w:line="276"/>
+        <w:jc w:val="both"/>
+      </w:pPr>
+      <w:r>
+        <w:rPr>
+          <w:rFonts w:ascii="Georgia" w:cs="Georgia" w:eastAsia="Georgia" w:hAnsi="Georgia"/>
+          <w:color w:val="1a1a1a"/>
+          <w:sz w:val="21"/>
+          <w:szCs w:val="21"/>
+        </w:rPr>
+        <w:t xml:space="preserve">We attempted to express every record of two public exercise databases in OMEN. The Free Exercise DB contains 876 exercises, of which 198 lie outside the declared scope (stretching, cardiovascular and plyometric entries), leaving </w:t>
+      </w:r>
+      <w:r>
+        <w:rPr>
+          <w:rFonts w:ascii="Georgia" w:cs="Georgia" w:eastAsia="Georgia" w:hAnsi="Georgia"/>
+          <w:b/>
+          <w:bCs/>
+          <w:color w:val="1a1a1a"/>
+          <w:sz w:val="21"/>
+          <w:szCs w:val="21"/>
+        </w:rPr>
+        <w:t xml:space="preserve">678 resistance-training records</w:t>
+      </w:r>
+      <w:r>
+        <w:rPr>
+          <w:rFonts w:ascii="Georgia" w:cs="Georgia" w:eastAsia="Georgia" w:hAnsi="Georgia"/>
+          <w:color w:val="1a1a1a"/>
+          <w:sz w:val="21"/>
+          <w:szCs w:val="21"/>
+        </w:rPr>
+        <w:t xml:space="preserve">. The second corpus, wger, contributes </w:t>
+      </w:r>
+      <w:r>
+        <w:rPr>
+          <w:rFonts w:ascii="Georgia" w:cs="Georgia" w:eastAsia="Georgia" w:hAnsi="Georgia"/>
+          <w:b/>
+          <w:bCs/>
+          <w:color w:val="1a1a1a"/>
+          <w:sz w:val="21"/>
+          <w:szCs w:val="21"/>
+        </w:rPr>
+        <w:t xml:space="preserve">847</w:t>
+      </w:r>
+      <w:r>
+        <w:rPr>
+          <w:rFonts w:ascii="Georgia" w:cs="Georgia" w:eastAsia="Georgia" w:hAnsi="Georgia"/>
+          <w:color w:val="1a1a1a"/>
+          <w:sz w:val="21"/>
+          <w:szCs w:val="21"/>
+        </w:rPr>
+        <w:t xml:space="preserve"> English-language exercises written under different naming conventions. Each record was mapped onto OMEN facets by a deterministic script reading the database's structured fields together with the tokens of its display name, drawing only on the controlled vocabularies. Critically, </w:t>
+      </w:r>
+      <w:r>
+        <w:rPr>
+          <w:rFonts w:ascii="Georgia" w:cs="Georgia" w:eastAsia="Georgia" w:hAnsi="Georgia"/>
+          <w:b/>
+          <w:bCs/>
+          <w:color w:val="1a1a1a"/>
+          <w:sz w:val="21"/>
+          <w:szCs w:val="21"/>
+        </w:rPr>
+        <w:t xml:space="preserve">the identical mapping script was used on both corpora</w:t>
+      </w:r>
+      <w:r>
+        <w:rPr>
+          <w:rFonts w:ascii="Georgia" w:cs="Georgia" w:eastAsia="Georgia" w:hAnsi="Georgia"/>
+          <w:color w:val="1a1a1a"/>
+          <w:sz w:val="21"/>
+          <w:szCs w:val="21"/>
+        </w:rPr>
+        <w:t xml:space="preserve">, so the second audit measures the standard rather than a per-corpus heuristic. Failures were separated into three kinds, because they license different conclusions: records requiring a term OMEN does not define, records the automated mapper could not resolve, and records whose own fields do not disclose enough to encode at all.</w:t>
+      </w:r>
+    </w:p>
+    <w:tbl>
+      <w:tblPr>
+        <w:tblW w:type="dxa" w:w="9360"/>
+        <w:tblBorders>
+          <w:top w:val="single" w:color="cccccc" w:sz="4"/>
+          <w:left w:val="single" w:color="cccccc" w:sz="4"/>
+          <w:bottom w:val="single" w:color="cccccc" w:sz="4"/>
+          <w:right w:val="single" w:color="cccccc" w:sz="4"/>
+          <w:insideH w:val="single" w:color="cccccc" w:sz="2"/>
+          <w:insideV w:val="single" w:color="cccccc" w:sz="2"/>
+        </w:tblBorders>
+      </w:tblPr>
+      <w:tblGrid>
+        <w:gridCol w:w="2100"/>
+        <w:gridCol w:w="1100"/>
+        <w:gridCol w:w="1400"/>
+        <w:gridCol w:w="1200"/>
+        <w:gridCol w:w="1800"/>
+        <w:gridCol w:w="1760"/>
+      </w:tblGrid>
+      <w:tr>
+        <w:trPr>
+          <w:tblHeader/>
+        </w:trPr>
+        <w:tc>
+          <w:tcPr>
+            <w:tcW w:type="dxa" w:w="2100"/>
+            <w:shd w:fill="6a2c91" w:val="clear"/>
+            <w:tcMar>
+              <w:top w:type="dxa" w:w="60"/>
+              <w:left w:type="dxa" w:w="90"/>
+              <w:bottom w:type="dxa" w:w="60"/>
+              <w:right w:type="dxa" w:w="90"/>
+            </w:tcMar>
+          </w:tcPr>
+          <w:p>
+            <w:r>
+              <w:rPr>
+                <w:rFonts w:ascii="Calibri" w:cs="Calibri" w:eastAsia="Calibri" w:hAnsi="Calibri"/>
+                <w:b/>
+                <w:bCs/>
+                <w:color w:val="ffffff"/>
+                <w:sz w:val="18"/>
+                <w:szCs w:val="18"/>
+              </w:rPr>
+              <w:t xml:space="preserve">Corpus</w:t>
+            </w:r>
+          </w:p>
+        </w:tc>
+        <w:tc>
+          <w:tcPr>
+            <w:tcW w:type="dxa" w:w="1100"/>
+            <w:shd w:fill="6a2c91" w:val="clear"/>
+            <w:tcMar>
+              <w:top w:type="dxa" w:w="60"/>
+              <w:left w:type="dxa" w:w="90"/>
+              <w:bottom w:type="dxa" w:w="60"/>
+              <w:right w:type="dxa" w:w="90"/>
+            </w:tcMar>
+          </w:tcPr>
+          <w:p>
+            <w:r>
+              <w:rPr>
+                <w:rFonts w:ascii="Calibri" w:cs="Calibri" w:eastAsia="Calibri" w:hAnsi="Calibri"/>
+                <w:b/>
+                <w:bCs/>
+                <w:color w:val="ffffff"/>
+                <w:sz w:val="18"/>
+                <w:szCs w:val="18"/>
+              </w:rPr>
+              <w:t xml:space="preserve">In scope</w:t>
+            </w:r>
+          </w:p>
+        </w:tc>
+        <w:tc>
+          <w:tcPr>
+            <w:tcW w:type="dxa" w:w="1400"/>
+            <w:shd w:fill="6a2c91" w:val="clear"/>
+            <w:tcMar>
+              <w:top w:type="dxa" w:w="60"/>
+              <w:left w:type="dxa" w:w="90"/>
+              <w:bottom w:type="dxa" w:w="60"/>
+              <w:right w:type="dxa" w:w="90"/>
+            </w:tcMar>
+          </w:tcPr>
+          <w:p>
+            <w:r>
+              <w:rPr>
+                <w:rFonts w:ascii="Calibri" w:cs="Calibri" w:eastAsia="Calibri" w:hAnsi="Calibri"/>
+                <w:b/>
+                <w:bCs/>
+                <w:color w:val="ffffff"/>
+                <w:sz w:val="18"/>
+                <w:szCs w:val="18"/>
+              </w:rPr>
+              <w:t xml:space="preserve">Encodable</w:t>
+            </w:r>
+          </w:p>
+        </w:tc>
+        <w:tc>
+          <w:tcPr>
+            <w:tcW w:type="dxa" w:w="1200"/>
+            <w:shd w:fill="6a2c91" w:val="clear"/>
+            <w:tcMar>
+              <w:top w:type="dxa" w:w="60"/>
+              <w:left w:type="dxa" w:w="90"/>
+              <w:bottom w:type="dxa" w:w="60"/>
+              <w:right w:type="dxa" w:w="90"/>
+            </w:tcMar>
+          </w:tcPr>
+          <w:p>
+            <w:r>
+              <w:rPr>
+                <w:rFonts w:ascii="Calibri" w:cs="Calibri" w:eastAsia="Calibri" w:hAnsi="Calibri"/>
+                <w:b/>
+                <w:bCs/>
+                <w:color w:val="ffffff"/>
+                <w:sz w:val="18"/>
+                <w:szCs w:val="18"/>
+              </w:rPr>
+              <w:t xml:space="preserve">OMEN gap</w:t>
+            </w:r>
+          </w:p>
+        </w:tc>
+        <w:tc>
+          <w:tcPr>
+            <w:tcW w:type="dxa" w:w="1800"/>
+            <w:shd w:fill="6a2c91" w:val="clear"/>
+            <w:tcMar>
+              <w:top w:type="dxa" w:w="60"/>
+              <w:left w:type="dxa" w:w="90"/>
+              <w:bottom w:type="dxa" w:w="60"/>
+              <w:right w:type="dxa" w:w="90"/>
+            </w:tcMar>
+          </w:tcPr>
+          <w:p>
+            <w:r>
+              <w:rPr>
+                <w:rFonts w:ascii="Calibri" w:cs="Calibri" w:eastAsia="Calibri" w:hAnsi="Calibri"/>
+                <w:b/>
+                <w:bCs/>
+                <w:color w:val="ffffff"/>
+                <w:sz w:val="18"/>
+                <w:szCs w:val="18"/>
+              </w:rPr>
+              <w:t xml:space="preserve">Not encodable</w:t>
+            </w:r>
+          </w:p>
+        </w:tc>
+        <w:tc>
+          <w:tcPr>
+            <w:tcW w:type="dxa" w:w="1760"/>
+            <w:shd w:fill="6a2c91" w:val="clear"/>
+            <w:tcMar>
+              <w:top w:type="dxa" w:w="60"/>
+              <w:left w:type="dxa" w:w="90"/>
+              <w:bottom w:type="dxa" w:w="60"/>
+              <w:right w:type="dxa" w:w="90"/>
+            </w:tcMar>
+          </w:tcPr>
+          <w:p>
+            <w:r>
+              <w:rPr>
+                <w:rFonts w:ascii="Calibri" w:cs="Calibri" w:eastAsia="Calibri" w:hAnsi="Calibri"/>
+                <w:b/>
+                <w:bCs/>
+                <w:color w:val="ffffff"/>
+                <w:sz w:val="18"/>
+                <w:szCs w:val="18"/>
+              </w:rPr>
+              <w:t xml:space="preserve">Coverage</w:t>
+            </w:r>
+          </w:p>
+        </w:tc>
+      </w:tr>
+      <w:tr>
+        <w:tc>
+          <w:tcPr>
+            <w:tcW w:type="dxa" w:w="2100"/>
+            <w:shd w:fill="ffffff" w:val="clear"/>
+            <w:tcMar>
+              <w:top w:type="dxa" w:w="60"/>
+              <w:left w:type="dxa" w:w="90"/>
+              <w:bottom w:type="dxa" w:w="60"/>
+              <w:right w:type="dxa" w:w="90"/>
+            </w:tcMar>
+          </w:tcPr>
+          <w:p>
+            <w:r>
+              <w:rPr>
+                <w:rFonts w:ascii="Calibri" w:cs="Calibri" w:eastAsia="Calibri" w:hAnsi="Calibri"/>
+                <w:b w:val="false"/>
+                <w:bCs w:val="false"/>
+                <w:color w:val="1a1a1a"/>
+                <w:sz w:val="18"/>
+                <w:szCs w:val="18"/>
+              </w:rPr>
+              <w:t xml:space="preserve">Free Exercise DB</w:t>
+            </w:r>
+          </w:p>
+        </w:tc>
+        <w:tc>
+          <w:tcPr>
+            <w:tcW w:type="dxa" w:w="1100"/>
+            <w:shd w:fill="ffffff" w:val="clear"/>
+            <w:tcMar>
+              <w:top w:type="dxa" w:w="60"/>
+              <w:left w:type="dxa" w:w="90"/>
+              <w:bottom w:type="dxa" w:w="60"/>
+              <w:right w:type="dxa" w:w="90"/>
+            </w:tcMar>
+          </w:tcPr>
+          <w:p>
+            <w:r>
+              <w:rPr>
+                <w:rFonts w:ascii="Calibri" w:cs="Calibri" w:eastAsia="Calibri" w:hAnsi="Calibri"/>
+                <w:b w:val="false"/>
+                <w:bCs w:val="false"/>
+                <w:color w:val="1a1a1a"/>
+                <w:sz w:val="18"/>
+                <w:szCs w:val="18"/>
+              </w:rPr>
+              <w:t xml:space="preserve">678</w:t>
+            </w:r>
+          </w:p>
+        </w:tc>
+        <w:tc>
+          <w:tcPr>
+            <w:tcW w:type="dxa" w:w="1400"/>
+            <w:shd w:fill="ffffff" w:val="clear"/>
+            <w:tcMar>
+              <w:top w:type="dxa" w:w="60"/>
+              <w:left w:type="dxa" w:w="90"/>
+              <w:bottom w:type="dxa" w:w="60"/>
+              <w:right w:type="dxa" w:w="90"/>
+            </w:tcMar>
+          </w:tcPr>
+          <w:p>
+            <w:r>
+              <w:rPr>
+                <w:rFonts w:ascii="Calibri" w:cs="Calibri" w:eastAsia="Calibri" w:hAnsi="Calibri"/>
+                <w:b w:val="false"/>
+                <w:bCs w:val="false"/>
+                <w:color w:val="1a1a1a"/>
+                <w:sz w:val="18"/>
+                <w:szCs w:val="18"/>
+              </w:rPr>
+              <w:t xml:space="preserve">574</w:t>
+            </w:r>
+          </w:p>
+        </w:tc>
+        <w:tc>
+          <w:tcPr>
+            <w:tcW w:type="dxa" w:w="1200"/>
+            <w:shd w:fill="ffffff" w:val="clear"/>
+            <w:tcMar>
+              <w:top w:type="dxa" w:w="60"/>
+              <w:left w:type="dxa" w:w="90"/>
+              <w:bottom w:type="dxa" w:w="60"/>
+              <w:right w:type="dxa" w:w="90"/>
+            </w:tcMar>
+          </w:tcPr>
+          <w:p>
+            <w:r>
+              <w:rPr>
+                <w:rFonts w:ascii="Calibri" w:cs="Calibri" w:eastAsia="Calibri" w:hAnsi="Calibri"/>
+                <w:b w:val="false"/>
+                <w:bCs w:val="false"/>
+                <w:color w:val="1a1a1a"/>
+                <w:sz w:val="18"/>
+                <w:szCs w:val="18"/>
+              </w:rPr>
+              <w:t xml:space="preserve">54</w:t>
+            </w:r>
+          </w:p>
+        </w:tc>
+        <w:tc>
+          <w:tcPr>
+            <w:tcW w:type="dxa" w:w="1800"/>
+            <w:shd w:fill="ffffff" w:val="clear"/>
+            <w:tcMar>
+              <w:top w:type="dxa" w:w="60"/>
+              <w:left w:type="dxa" w:w="90"/>
+              <w:bottom w:type="dxa" w:w="60"/>
+              <w:right w:type="dxa" w:w="90"/>
+            </w:tcMar>
+          </w:tcPr>
+          <w:p>
+            <w:r>
+              <w:rPr>
+                <w:rFonts w:ascii="Calibri" w:cs="Calibri" w:eastAsia="Calibri" w:hAnsi="Calibri"/>
+                <w:b w:val="false"/>
+                <w:bCs w:val="false"/>
+                <w:color w:val="1a1a1a"/>
+                <w:sz w:val="18"/>
+                <w:szCs w:val="18"/>
+              </w:rPr>
+              <w:t xml:space="preserve">50</w:t>
+            </w:r>
+          </w:p>
+        </w:tc>
+        <w:tc>
+          <w:tcPr>
+            <w:tcW w:type="dxa" w:w="1760"/>
+            <w:shd w:fill="ffffff" w:val="clear"/>
+            <w:tcMar>
+              <w:top w:type="dxa" w:w="60"/>
+              <w:left w:type="dxa" w:w="90"/>
+              <w:bottom w:type="dxa" w:w="60"/>
+              <w:right w:type="dxa" w:w="90"/>
+            </w:tcMar>
+          </w:tcPr>
+          <w:p>
+            <w:r>
+              <w:rPr>
+                <w:rFonts w:ascii="Calibri" w:cs="Calibri" w:eastAsia="Calibri" w:hAnsi="Calibri"/>
+                <w:b w:val="false"/>
+                <w:bCs w:val="false"/>
+                <w:color w:val="1a1a1a"/>
+                <w:sz w:val="18"/>
+                <w:szCs w:val="18"/>
+              </w:rPr>
+              <w:t xml:space="preserve">84.7%  (91.4%)</w:t>
+            </w:r>
+          </w:p>
+        </w:tc>
+      </w:tr>
+      <w:tr>
+        <w:tc>
+          <w:tcPr>
+            <w:tcW w:type="dxa" w:w="2100"/>
+            <w:shd w:fill="ffffff" w:val="clear"/>
+            <w:tcMar>
+              <w:top w:type="dxa" w:w="60"/>
+              <w:left w:type="dxa" w:w="90"/>
+              <w:bottom w:type="dxa" w:w="60"/>
+              <w:right w:type="dxa" w:w="90"/>
+            </w:tcMar>
+          </w:tcPr>
+          <w:p>
+            <w:r>
+              <w:rPr>
+                <w:rFonts w:ascii="Calibri" w:cs="Calibri" w:eastAsia="Calibri" w:hAnsi="Calibri"/>
+                <w:b w:val="false"/>
+                <w:bCs w:val="false"/>
+                <w:color w:val="1a1a1a"/>
+                <w:sz w:val="18"/>
+                <w:szCs w:val="18"/>
+              </w:rPr>
+              <w:t xml:space="preserve">wger</w:t>
+            </w:r>
+          </w:p>
+        </w:tc>
+        <w:tc>
+          <w:tcPr>
+            <w:tcW w:type="dxa" w:w="1100"/>
+            <w:shd w:fill="ffffff" w:val="clear"/>
+            <w:tcMar>
+              <w:top w:type="dxa" w:w="60"/>
+              <w:left w:type="dxa" w:w="90"/>
+              <w:bottom w:type="dxa" w:w="60"/>
+              <w:right w:type="dxa" w:w="90"/>
+            </w:tcMar>
+          </w:tcPr>
+          <w:p>
+            <w:r>
+              <w:rPr>
+                <w:rFonts w:ascii="Calibri" w:cs="Calibri" w:eastAsia="Calibri" w:hAnsi="Calibri"/>
+                <w:b w:val="false"/>
+                <w:bCs w:val="false"/>
+                <w:color w:val="1a1a1a"/>
+                <w:sz w:val="18"/>
+                <w:szCs w:val="18"/>
+              </w:rPr>
+              <w:t xml:space="preserve">847</w:t>
+            </w:r>
+          </w:p>
+        </w:tc>
+        <w:tc>
+          <w:tcPr>
+            <w:tcW w:type="dxa" w:w="1400"/>
+            <w:shd w:fill="ffffff" w:val="clear"/>
+            <w:tcMar>
+              <w:top w:type="dxa" w:w="60"/>
+              <w:left w:type="dxa" w:w="90"/>
+              <w:bottom w:type="dxa" w:w="60"/>
+              <w:right w:type="dxa" w:w="90"/>
+            </w:tcMar>
+          </w:tcPr>
+          <w:p>
+            <w:r>
+              <w:rPr>
+                <w:rFonts w:ascii="Calibri" w:cs="Calibri" w:eastAsia="Calibri" w:hAnsi="Calibri"/>
+                <w:b w:val="false"/>
+                <w:bCs w:val="false"/>
+                <w:color w:val="1a1a1a"/>
+                <w:sz w:val="18"/>
+                <w:szCs w:val="18"/>
+              </w:rPr>
+              <w:t xml:space="preserve">590</w:t>
+            </w:r>
+          </w:p>
+        </w:tc>
+        <w:tc>
+          <w:tcPr>
+            <w:tcW w:type="dxa" w:w="1200"/>
+            <w:shd w:fill="ffffff" w:val="clear"/>
+            <w:tcMar>
+              <w:top w:type="dxa" w:w="60"/>
+              <w:left w:type="dxa" w:w="90"/>
+              <w:bottom w:type="dxa" w:w="60"/>
+              <w:right w:type="dxa" w:w="90"/>
+            </w:tcMar>
+          </w:tcPr>
+          <w:p>
+            <w:r>
+              <w:rPr>
+                <w:rFonts w:ascii="Calibri" w:cs="Calibri" w:eastAsia="Calibri" w:hAnsi="Calibri"/>
+                <w:b w:val="false"/>
+                <w:bCs w:val="false"/>
+                <w:color w:val="1a1a1a"/>
+                <w:sz w:val="18"/>
+                <w:szCs w:val="18"/>
+              </w:rPr>
+              <w:t xml:space="preserve">16</w:t>
+            </w:r>
+          </w:p>
+        </w:tc>
+        <w:tc>
+          <w:tcPr>
+            <w:tcW w:type="dxa" w:w="1800"/>
+            <w:shd w:fill="ffffff" w:val="clear"/>
+            <w:tcMar>
+              <w:top w:type="dxa" w:w="60"/>
+              <w:left w:type="dxa" w:w="90"/>
+              <w:bottom w:type="dxa" w:w="60"/>
+              <w:right w:type="dxa" w:w="90"/>
+            </w:tcMar>
+          </w:tcPr>
+          <w:p>
+            <w:r>
+              <w:rPr>
+                <w:rFonts w:ascii="Calibri" w:cs="Calibri" w:eastAsia="Calibri" w:hAnsi="Calibri"/>
+                <w:b w:val="false"/>
+                <w:bCs w:val="false"/>
+                <w:color w:val="1a1a1a"/>
+                <w:sz w:val="18"/>
+                <w:szCs w:val="18"/>
+              </w:rPr>
+              <w:t xml:space="preserve">241</w:t>
+            </w:r>
+          </w:p>
+        </w:tc>
+        <w:tc>
+          <w:tcPr>
+            <w:tcW w:type="dxa" w:w="1760"/>
+            <w:shd w:fill="ffffff" w:val="clear"/>
+            <w:tcMar>
+              <w:top w:type="dxa" w:w="60"/>
+              <w:left w:type="dxa" w:w="90"/>
+              <w:bottom w:type="dxa" w:w="60"/>
+              <w:right w:type="dxa" w:w="90"/>
+            </w:tcMar>
+          </w:tcPr>
+          <w:p>
+            <w:r>
+              <w:rPr>
+                <w:rFonts w:ascii="Calibri" w:cs="Calibri" w:eastAsia="Calibri" w:hAnsi="Calibri"/>
+                <w:b w:val="false"/>
+                <w:bCs w:val="false"/>
+                <w:color w:val="1a1a1a"/>
+                <w:sz w:val="18"/>
+                <w:szCs w:val="18"/>
+              </w:rPr>
+              <w:t xml:space="preserve">69.7%  (89.8%)</w:t>
+            </w:r>
+          </w:p>
+        </w:tc>
+      </w:tr>
+    </w:tbl>
+    <w:p>
+      <w:pPr>
+        <w:spacing w:after="180"/>
+      </w:pPr>
+      <w:r>
+        <w:rPr>
+          <w:rFonts w:ascii="Calibri" w:cs="Calibri" w:eastAsia="Calibri" w:hAnsi="Calibri"/>
+          <w:i/>
+          <w:iCs/>
+          <w:color w:val="5a5a5a"/>
+          <w:sz w:val="17"/>
+          <w:szCs w:val="17"/>
+        </w:rPr>
+        <w:t xml:space="preserve">Table 4. Coverage of two independent exercise databases. The bracketed figure is coverage of records carrying enough information to be encoded at all; the unbracketed figure includes records the source itself leaves underspecified. For wger the last column separates 16 genuine vocabulary gaps from 51 records the automated mapper could not resolve and 190 the source does not specify.</w:t>
+      </w:r>
+    </w:p>
+    <w:p>
+      <w:pPr>
+        <w:spacing w:after="140" w:line="276"/>
+        <w:jc w:val="both"/>
+      </w:pPr>
+      <w:r>
+        <w:rPr>
+          <w:rFonts w:ascii="Georgia" w:cs="Georgia" w:eastAsia="Georgia" w:hAnsi="Georgia"/>
+          <w:color w:val="1a1a1a"/>
+          <w:sz w:val="21"/>
+          <w:szCs w:val="21"/>
+        </w:rPr>
+        <w:t xml:space="preserve">Coverage is therefore </w:t>
+      </w:r>
+      <w:r>
+        <w:rPr>
+          <w:rFonts w:ascii="Georgia" w:cs="Georgia" w:eastAsia="Georgia" w:hAnsi="Georgia"/>
+          <w:b/>
+          <w:bCs/>
+          <w:color w:val="1a1a1a"/>
+          <w:sz w:val="21"/>
+          <w:szCs w:val="21"/>
+        </w:rPr>
+        <w:t xml:space="preserve">84.7%</w:t>
+      </w:r>
+      <w:r>
+        <w:rPr>
+          <w:rFonts w:ascii="Georgia" w:cs="Georgia" w:eastAsia="Georgia" w:hAnsi="Georgia"/>
+          <w:color w:val="1a1a1a"/>
+          <w:sz w:val="21"/>
+          <w:szCs w:val="21"/>
+        </w:rPr>
+        <w:t xml:space="preserve"> and </w:t>
+      </w:r>
+      <w:r>
+        <w:rPr>
+          <w:rFonts w:ascii="Georgia" w:cs="Georgia" w:eastAsia="Georgia" w:hAnsi="Georgia"/>
+          <w:b/>
+          <w:bCs/>
+          <w:color w:val="1a1a1a"/>
+          <w:sz w:val="21"/>
+          <w:szCs w:val="21"/>
+        </w:rPr>
+        <w:t xml:space="preserve">69.7%</w:t>
+      </w:r>
+      <w:r>
+        <w:rPr>
+          <w:rFonts w:ascii="Georgia" w:cs="Georgia" w:eastAsia="Georgia" w:hAnsi="Georgia"/>
+          <w:color w:val="1a1a1a"/>
+          <w:sz w:val="21"/>
+          <w:szCs w:val="21"/>
+        </w:rPr>
+        <w:t xml:space="preserve"> of all in-scope records, or </w:t>
+      </w:r>
+      <w:r>
+        <w:rPr>
+          <w:rFonts w:ascii="Georgia" w:cs="Georgia" w:eastAsia="Georgia" w:hAnsi="Georgia"/>
+          <w:b/>
+          <w:bCs/>
+          <w:color w:val="1a1a1a"/>
+          <w:sz w:val="21"/>
+          <w:szCs w:val="21"/>
+        </w:rPr>
+        <w:t xml:space="preserve">91.4%</w:t>
+      </w:r>
+      <w:r>
+        <w:rPr>
+          <w:rFonts w:ascii="Georgia" w:cs="Georgia" w:eastAsia="Georgia" w:hAnsi="Georgia"/>
+          <w:color w:val="1a1a1a"/>
+          <w:sz w:val="21"/>
+          <w:szCs w:val="21"/>
+        </w:rPr>
+        <w:t xml:space="preserve"> and </w:t>
+      </w:r>
+      <w:r>
+        <w:rPr>
+          <w:rFonts w:ascii="Georgia" w:cs="Georgia" w:eastAsia="Georgia" w:hAnsi="Georgia"/>
+          <w:b/>
+          <w:bCs/>
+          <w:color w:val="1a1a1a"/>
+          <w:sz w:val="21"/>
+          <w:szCs w:val="21"/>
+        </w:rPr>
+        <w:t xml:space="preserve">89.8%</w:t>
+      </w:r>
+      <w:r>
+        <w:rPr>
+          <w:rFonts w:ascii="Georgia" w:cs="Georgia" w:eastAsia="Georgia" w:hAnsi="Georgia"/>
+          <w:color w:val="1a1a1a"/>
+          <w:sz w:val="21"/>
+          <w:szCs w:val="21"/>
+        </w:rPr>
+        <w:t xml:space="preserve"> of records carrying sufficient information. The agreement between two corpora with different naming conventions, audited by the same script, is the more informative result: on wger only </w:t>
+      </w:r>
+      <w:r>
+        <w:rPr>
+          <w:rFonts w:ascii="Georgia" w:cs="Georgia" w:eastAsia="Georgia" w:hAnsi="Georgia"/>
+          <w:b/>
+          <w:bCs/>
+          <w:color w:val="1a1a1a"/>
+          <w:sz w:val="21"/>
+          <w:szCs w:val="21"/>
+        </w:rPr>
+        <w:t xml:space="preserve">16 records (1.9%)</w:t>
+      </w:r>
+      <w:r>
+        <w:rPr>
+          <w:rFonts w:ascii="Georgia" w:cs="Georgia" w:eastAsia="Georgia" w:hAnsi="Georgia"/>
+          <w:color w:val="1a1a1a"/>
+          <w:sz w:val="21"/>
+          <w:szCs w:val="21"/>
+        </w:rPr>
+        <w:t xml:space="preserve"> required a term the standard does not define.</w:t>
+      </w:r>
+    </w:p>
+    <w:p>
+      <w:pPr>
+        <w:pStyle w:val="Heading2"/>
+        <w:spacing w:after="100" w:before="220"/>
+      </w:pPr>
+      <w:r>
+        <w:rPr>
+          <w:rFonts w:ascii="Calibri" w:cs="Calibri" w:eastAsia="Calibri" w:hAnsi="Calibri"/>
+          <w:b/>
+          <w:bCs/>
+          <w:color w:val="1a1a1a"/>
+          <w:sz w:val="24"/>
+          <w:szCs w:val="24"/>
+        </w:rPr>
+        <w:t xml:space="preserve">9.2 What remains uncovered is one principled category</w:t>
+      </w:r>
+    </w:p>
+    <w:p>
+      <w:pPr>
+        <w:spacing w:after="140" w:line="276"/>
+        <w:jc w:val="both"/>
+      </w:pPr>
+      <w:r>
+        <w:rPr>
+          <w:rFonts w:ascii="Georgia" w:cs="Georgia" w:eastAsia="Georgia" w:hAnsi="Georgia"/>
+          <w:color w:val="1a1a1a"/>
+          <w:sz w:val="21"/>
+          <w:szCs w:val="21"/>
+        </w:rPr>
+        <w:t xml:space="preserve">Earlier drafts of this standard showed gaps scattered across many unrelated concepts. Completing each joint's action set (Section 3) removed almost all of them. What survives is not a miscellany but a single coherent class: movements composed of </w:t>
+      </w:r>
+      <w:r>
+        <w:rPr>
+          <w:rFonts w:ascii="Georgia" w:cs="Georgia" w:eastAsia="Georgia" w:hAnsi="Georgia"/>
+          <w:i/>
+          <w:iCs/>
+          <w:color w:val="1a1a1a"/>
+          <w:sz w:val="21"/>
+          <w:szCs w:val="21"/>
+        </w:rPr>
+        <w:t xml:space="preserve">several patterns in sequence</w:t>
+      </w:r>
+      <w:r>
+        <w:rPr>
+          <w:rFonts w:ascii="Georgia" w:cs="Georgia" w:eastAsia="Georgia" w:hAnsi="Georgia"/>
+          <w:color w:val="1a1a1a"/>
+          <w:sz w:val="21"/>
+          <w:szCs w:val="21"/>
+        </w:rPr>
+        <w:t xml:space="preserve">.</w:t>
+      </w:r>
+    </w:p>
+    <w:tbl>
+      <w:tblPr>
+        <w:tblW w:type="dxa" w:w="9360"/>
+        <w:tblBorders>
+          <w:top w:val="single" w:color="cccccc" w:sz="4"/>
+          <w:left w:val="single" w:color="cccccc" w:sz="4"/>
+          <w:bottom w:val="single" w:color="cccccc" w:sz="4"/>
+          <w:right w:val="single" w:color="cccccc" w:sz="4"/>
+          <w:insideH w:val="single" w:color="cccccc" w:sz="2"/>
+          <w:insideV w:val="single" w:color="cccccc" w:sz="2"/>
+        </w:tblBorders>
+      </w:tblPr>
+      <w:tblGrid>
+        <w:gridCol w:w="5000"/>
+        <w:gridCol w:w="2180"/>
+        <w:gridCol w:w="2180"/>
+      </w:tblGrid>
+      <w:tr>
+        <w:trPr>
+          <w:tblHeader/>
+        </w:trPr>
+        <w:tc>
+          <w:tcPr>
+            <w:tcW w:type="dxa" w:w="5000"/>
+            <w:shd w:fill="6a2c91" w:val="clear"/>
+            <w:tcMar>
+              <w:top w:type="dxa" w:w="60"/>
+              <w:left w:type="dxa" w:w="90"/>
+              <w:bottom w:type="dxa" w:w="60"/>
+              <w:right w:type="dxa" w:w="90"/>
+            </w:tcMar>
+          </w:tcPr>
+          <w:p>
+            <w:r>
+              <w:rPr>
+                <w:rFonts w:ascii="Calibri" w:cs="Calibri" w:eastAsia="Calibri" w:hAnsi="Calibri"/>
+                <w:b/>
+                <w:bCs/>
+                <w:color w:val="ffffff"/>
+                <w:sz w:val="18"/>
+                <w:szCs w:val="18"/>
+              </w:rPr>
+              <w:t xml:space="preserve">Concept still outside the vocabulary</w:t>
+            </w:r>
+          </w:p>
+        </w:tc>
+        <w:tc>
+          <w:tcPr>
+            <w:tcW w:type="dxa" w:w="2180"/>
+            <w:shd w:fill="6a2c91" w:val="clear"/>
+            <w:tcMar>
+              <w:top w:type="dxa" w:w="60"/>
+              <w:left w:type="dxa" w:w="90"/>
+              <w:bottom w:type="dxa" w:w="60"/>
+              <w:right w:type="dxa" w:w="90"/>
+            </w:tcMar>
+          </w:tcPr>
+          <w:p>
+            <w:r>
+              <w:rPr>
+                <w:rFonts w:ascii="Calibri" w:cs="Calibri" w:eastAsia="Calibri" w:hAnsi="Calibri"/>
+                <w:b/>
+                <w:bCs/>
+                <w:color w:val="ffffff"/>
+                <w:sz w:val="18"/>
+                <w:szCs w:val="18"/>
+              </w:rPr>
+              <w:t xml:space="preserve">Free Exercise DB</w:t>
+            </w:r>
+          </w:p>
+        </w:tc>
+        <w:tc>
+          <w:tcPr>
+            <w:tcW w:type="dxa" w:w="2180"/>
+            <w:shd w:fill="6a2c91" w:val="clear"/>
+            <w:tcMar>
+              <w:top w:type="dxa" w:w="60"/>
+              <w:left w:type="dxa" w:w="90"/>
+              <w:bottom w:type="dxa" w:w="60"/>
+              <w:right w:type="dxa" w:w="90"/>
+            </w:tcMar>
+          </w:tcPr>
+          <w:p>
+            <w:r>
+              <w:rPr>
+                <w:rFonts w:ascii="Calibri" w:cs="Calibri" w:eastAsia="Calibri" w:hAnsi="Calibri"/>
+                <w:b/>
+                <w:bCs/>
+                <w:color w:val="ffffff"/>
+                <w:sz w:val="18"/>
+                <w:szCs w:val="18"/>
+              </w:rPr>
+              <w:t xml:space="preserve">wger</w:t>
+            </w:r>
+          </w:p>
+        </w:tc>
+      </w:tr>
+      <w:tr>
+        <w:tc>
+          <w:tcPr>
+            <w:tcW w:type="dxa" w:w="5000"/>
+            <w:shd w:fill="ffffff" w:val="clear"/>
+            <w:tcMar>
+              <w:top w:type="dxa" w:w="60"/>
+              <w:left w:type="dxa" w:w="90"/>
+              <w:bottom w:type="dxa" w:w="60"/>
+              <w:right w:type="dxa" w:w="90"/>
+            </w:tcMar>
+          </w:tcPr>
+          <w:p>
+            <w:r>
+              <w:rPr>
+                <w:rFonts w:ascii="Calibri" w:cs="Calibri" w:eastAsia="Calibri" w:hAnsi="Calibri"/>
+                <w:b w:val="false"/>
+                <w:bCs w:val="false"/>
+                <w:color w:val="1a1a1a"/>
+                <w:sz w:val="18"/>
+                <w:szCs w:val="18"/>
+              </w:rPr>
+              <w:t xml:space="preserve">Olympic and other multi-phase lifts (clean, snatch, jerk)</w:t>
+            </w:r>
+          </w:p>
+        </w:tc>
+        <w:tc>
+          <w:tcPr>
+            <w:tcW w:type="dxa" w:w="2180"/>
+            <w:shd w:fill="ffffff" w:val="clear"/>
+            <w:tcMar>
+              <w:top w:type="dxa" w:w="60"/>
+              <w:left w:type="dxa" w:w="90"/>
+              <w:bottom w:type="dxa" w:w="60"/>
+              <w:right w:type="dxa" w:w="90"/>
+            </w:tcMar>
+          </w:tcPr>
+          <w:p>
+            <w:r>
+              <w:rPr>
+                <w:rFonts w:ascii="Calibri" w:cs="Calibri" w:eastAsia="Calibri" w:hAnsi="Calibri"/>
+                <w:b w:val="false"/>
+                <w:bCs w:val="false"/>
+                <w:color w:val="1a1a1a"/>
+                <w:sz w:val="18"/>
+                <w:szCs w:val="18"/>
+              </w:rPr>
+              <w:t xml:space="preserve">50</w:t>
+            </w:r>
+          </w:p>
+        </w:tc>
+        <w:tc>
+          <w:tcPr>
+            <w:tcW w:type="dxa" w:w="2180"/>
+            <w:shd w:fill="ffffff" w:val="clear"/>
+            <w:tcMar>
+              <w:top w:type="dxa" w:w="60"/>
+              <w:left w:type="dxa" w:w="90"/>
+              <w:bottom w:type="dxa" w:w="60"/>
+              <w:right w:type="dxa" w:w="90"/>
+            </w:tcMar>
+          </w:tcPr>
+          <w:p>
+            <w:r>
+              <w:rPr>
+                <w:rFonts w:ascii="Calibri" w:cs="Calibri" w:eastAsia="Calibri" w:hAnsi="Calibri"/>
+                <w:b w:val="false"/>
+                <w:bCs w:val="false"/>
+                <w:color w:val="1a1a1a"/>
+                <w:sz w:val="18"/>
+                <w:szCs w:val="18"/>
+              </w:rPr>
+              <w:t xml:space="preserve">9</w:t>
+            </w:r>
+          </w:p>
+        </w:tc>
+      </w:tr>
+      <w:tr>
+        <w:tc>
+          <w:tcPr>
+            <w:tcW w:type="dxa" w:w="5000"/>
+            <w:shd w:fill="ffffff" w:val="clear"/>
+            <w:tcMar>
+              <w:top w:type="dxa" w:w="60"/>
+              <w:left w:type="dxa" w:w="90"/>
+              <w:bottom w:type="dxa" w:w="60"/>
+              <w:right w:type="dxa" w:w="90"/>
+            </w:tcMar>
+          </w:tcPr>
+          <w:p>
+            <w:r>
+              <w:rPr>
+                <w:rFonts w:ascii="Calibri" w:cs="Calibri" w:eastAsia="Calibri" w:hAnsi="Calibri"/>
+                <w:b w:val="false"/>
+                <w:bCs w:val="false"/>
+                <w:color w:val="1a1a1a"/>
+                <w:sz w:val="18"/>
+                <w:szCs w:val="18"/>
+              </w:rPr>
+              <w:t xml:space="preserve">Complex multi-pattern movements (thruster, Turkish get-up)</w:t>
+            </w:r>
+          </w:p>
+        </w:tc>
+        <w:tc>
+          <w:tcPr>
+            <w:tcW w:type="dxa" w:w="2180"/>
+            <w:shd w:fill="ffffff" w:val="clear"/>
+            <w:tcMar>
+              <w:top w:type="dxa" w:w="60"/>
+              <w:left w:type="dxa" w:w="90"/>
+              <w:bottom w:type="dxa" w:w="60"/>
+              <w:right w:type="dxa" w:w="90"/>
+            </w:tcMar>
+          </w:tcPr>
+          <w:p>
+            <w:r>
+              <w:rPr>
+                <w:rFonts w:ascii="Calibri" w:cs="Calibri" w:eastAsia="Calibri" w:hAnsi="Calibri"/>
+                <w:b w:val="false"/>
+                <w:bCs w:val="false"/>
+                <w:color w:val="1a1a1a"/>
+                <w:sz w:val="18"/>
+                <w:szCs w:val="18"/>
+              </w:rPr>
+              <w:t xml:space="preserve">3</w:t>
+            </w:r>
+          </w:p>
+        </w:tc>
+        <w:tc>
+          <w:tcPr>
+            <w:tcW w:type="dxa" w:w="2180"/>
+            <w:shd w:fill="ffffff" w:val="clear"/>
+            <w:tcMar>
+              <w:top w:type="dxa" w:w="60"/>
+              <w:left w:type="dxa" w:w="90"/>
+              <w:bottom w:type="dxa" w:w="60"/>
+              <w:right w:type="dxa" w:w="90"/>
+            </w:tcMar>
+          </w:tcPr>
+          <w:p>
+            <w:r>
+              <w:rPr>
+                <w:rFonts w:ascii="Calibri" w:cs="Calibri" w:eastAsia="Calibri" w:hAnsi="Calibri"/>
+                <w:b w:val="false"/>
+                <w:bCs w:val="false"/>
+                <w:color w:val="1a1a1a"/>
+                <w:sz w:val="18"/>
+                <w:szCs w:val="18"/>
+              </w:rPr>
+              <w:t xml:space="preserve">5</w:t>
+            </w:r>
+          </w:p>
+        </w:tc>
+      </w:tr>
+      <w:tr>
+        <w:tc>
+          <w:tcPr>
+            <w:tcW w:type="dxa" w:w="5000"/>
+            <w:shd w:fill="ffffff" w:val="clear"/>
+            <w:tcMar>
+              <w:top w:type="dxa" w:w="60"/>
+              <w:left w:type="dxa" w:w="90"/>
+              <w:bottom w:type="dxa" w:w="60"/>
+              <w:right w:type="dxa" w:w="90"/>
+            </w:tcMar>
+          </w:tcPr>
+          <w:p>
+            <w:r>
+              <w:rPr>
+                <w:rFonts w:ascii="Calibri" w:cs="Calibri" w:eastAsia="Calibri" w:hAnsi="Calibri"/>
+                <w:b w:val="false"/>
+                <w:bCs w:val="false"/>
+                <w:color w:val="1a1a1a"/>
+                <w:sz w:val="18"/>
+                <w:szCs w:val="18"/>
+              </w:rPr>
+              <w:t xml:space="preserve">Grip and finger flexion</w:t>
+            </w:r>
+          </w:p>
+        </w:tc>
+        <w:tc>
+          <w:tcPr>
+            <w:tcW w:type="dxa" w:w="2180"/>
+            <w:shd w:fill="ffffff" w:val="clear"/>
+            <w:tcMar>
+              <w:top w:type="dxa" w:w="60"/>
+              <w:left w:type="dxa" w:w="90"/>
+              <w:bottom w:type="dxa" w:w="60"/>
+              <w:right w:type="dxa" w:w="90"/>
+            </w:tcMar>
+          </w:tcPr>
+          <w:p>
+            <w:r>
+              <w:rPr>
+                <w:rFonts w:ascii="Calibri" w:cs="Calibri" w:eastAsia="Calibri" w:hAnsi="Calibri"/>
+                <w:b w:val="false"/>
+                <w:bCs w:val="false"/>
+                <w:color w:val="1a1a1a"/>
+                <w:sz w:val="18"/>
+                <w:szCs w:val="18"/>
+              </w:rPr>
+              <w:t xml:space="preserve">1</w:t>
+            </w:r>
+          </w:p>
+        </w:tc>
+        <w:tc>
+          <w:tcPr>
+            <w:tcW w:type="dxa" w:w="2180"/>
+            <w:shd w:fill="ffffff" w:val="clear"/>
+            <w:tcMar>
+              <w:top w:type="dxa" w:w="60"/>
+              <w:left w:type="dxa" w:w="90"/>
+              <w:bottom w:type="dxa" w:w="60"/>
+              <w:right w:type="dxa" w:w="90"/>
+            </w:tcMar>
+          </w:tcPr>
+          <w:p>
+            <w:r>
+              <w:rPr>
+                <w:rFonts w:ascii="Calibri" w:cs="Calibri" w:eastAsia="Calibri" w:hAnsi="Calibri"/>
+                <w:b w:val="false"/>
+                <w:bCs w:val="false"/>
+                <w:color w:val="1a1a1a"/>
+                <w:sz w:val="18"/>
+                <w:szCs w:val="18"/>
+              </w:rPr>
+              <w:t xml:space="preserve">2</w:t>
+            </w:r>
+          </w:p>
+        </w:tc>
+      </w:tr>
+    </w:tbl>
+    <w:p>
+      <w:pPr>
+        <w:spacing w:after="180"/>
+      </w:pPr>
+      <w:r>
+        <w:rPr>
+          <w:rFonts w:ascii="Calibri" w:cs="Calibri" w:eastAsia="Calibri" w:hAnsi="Calibri"/>
+          <w:i/>
+          <w:iCs/>
+          <w:color w:val="5a5a5a"/>
+          <w:sz w:val="17"/>
+          <w:szCs w:val="17"/>
+        </w:rPr>
+        <w:t xml:space="preserve">Table 5. Every remaining gap in both corpora. 53 of 54 and 14 of 16 are multi-phase or composite movements.</w:t>
+      </w:r>
+    </w:p>
+    <w:p>
+      <w:pPr>
+        <w:spacing w:after="140" w:line="276"/>
+        <w:jc w:val="both"/>
+      </w:pPr>
+      <w:r>
+        <w:rPr>
+          <w:rFonts w:ascii="Georgia" w:cs="Georgia" w:eastAsia="Georgia" w:hAnsi="Georgia"/>
+          <w:color w:val="1a1a1a"/>
+          <w:sz w:val="21"/>
+          <w:szCs w:val="21"/>
+        </w:rPr>
+        <w:t xml:space="preserve">This is a scope boundary rather than a vocabulary omission, and it has the same shape as the dosage argument of Section 11: a clean is not one movement pattern but an ordered sequence of them. Naming it correctly requires a composite notation that </w:t>
+      </w:r>
+      <w:r>
+        <w:rPr>
+          <w:rFonts w:ascii="Georgia" w:cs="Georgia" w:eastAsia="Georgia" w:hAnsi="Georgia"/>
+          <w:i/>
+          <w:iCs/>
+          <w:color w:val="1a1a1a"/>
+          <w:sz w:val="21"/>
+          <w:szCs w:val="21"/>
+        </w:rPr>
+        <w:t xml:space="preserve">references</w:t>
+      </w:r>
+      <w:r>
+        <w:rPr>
+          <w:rFonts w:ascii="Georgia" w:cs="Georgia" w:eastAsia="Georgia" w:hAnsi="Georgia"/>
+          <w:color w:val="1a1a1a"/>
+          <w:sz w:val="21"/>
+          <w:szCs w:val="21"/>
+        </w:rPr>
+        <w:t xml:space="preserve"> OMEN keys rather than a new facet inside one. We regard that as the primary design question for the next version, and prefer to state it as an open problem than to force a sequence into a single-pattern record.</w:t>
+      </w:r>
+    </w:p>
+    <w:p>
+      <w:pPr>
+        <w:pStyle w:val="Heading2"/>
+        <w:spacing w:after="100" w:before="220"/>
+      </w:pPr>
+      <w:r>
+        <w:rPr>
+          <w:rFonts w:ascii="Calibri" w:cs="Calibri" w:eastAsia="Calibri" w:hAnsi="Calibri"/>
+          <w:b/>
+          <w:bCs/>
+          <w:color w:val="1a1a1a"/>
+          <w:sz w:val="24"/>
+          <w:szCs w:val="24"/>
+        </w:rPr>
+        <w:t xml:space="preserve">9.3 Synonymy captured and underspecification exposed</w:t>
+      </w:r>
+    </w:p>
+    <w:p>
+      <w:pPr>
+        <w:spacing w:after="140" w:line="276"/>
+        <w:jc w:val="both"/>
+      </w:pPr>
+      <w:r>
+        <w:rPr>
+          <w:rFonts w:ascii="Georgia" w:cs="Georgia" w:eastAsia="Georgia" w:hAnsi="Georgia"/>
+          <w:color w:val="1a1a1a"/>
+          <w:sz w:val="21"/>
+          <w:szCs w:val="21"/>
+        </w:rPr>
+        <w:t xml:space="preserve">Two by-products of the audit bear directly on the argument of Section 1. First, the 574 encodable Free Exercise DB records, written by their authors as 574 distinct names, resolved to </w:t>
+      </w:r>
+      <w:r>
+        <w:rPr>
+          <w:rFonts w:ascii="Georgia" w:cs="Georgia" w:eastAsia="Georgia" w:hAnsi="Georgia"/>
+          <w:b/>
+          <w:bCs/>
+          <w:color w:val="1a1a1a"/>
+          <w:sz w:val="21"/>
+          <w:szCs w:val="21"/>
+        </w:rPr>
+        <w:t xml:space="preserve">304 distinct keys</w:t>
+      </w:r>
+      <w:r>
+        <w:rPr>
+          <w:rFonts w:ascii="Georgia" w:cs="Georgia" w:eastAsia="Georgia" w:hAnsi="Georgia"/>
+          <w:color w:val="1a1a1a"/>
+          <w:sz w:val="21"/>
+          <w:szCs w:val="21"/>
+        </w:rPr>
+        <w:t xml:space="preserve">, forming </w:t>
+      </w:r>
+      <w:r>
+        <w:rPr>
+          <w:rFonts w:ascii="Georgia" w:cs="Georgia" w:eastAsia="Georgia" w:hAnsi="Georgia"/>
+          <w:b/>
+          <w:bCs/>
+          <w:color w:val="1a1a1a"/>
+          <w:sz w:val="21"/>
+          <w:szCs w:val="21"/>
+        </w:rPr>
+        <w:t xml:space="preserve">106 clusters</w:t>
+      </w:r>
+      <w:r>
+        <w:rPr>
+          <w:rFonts w:ascii="Georgia" w:cs="Georgia" w:eastAsia="Georgia" w:hAnsi="Georgia"/>
+          <w:color w:val="1a1a1a"/>
+          <w:sz w:val="21"/>
+          <w:szCs w:val="21"/>
+        </w:rPr>
+        <w:t xml:space="preserve"> in which two or more names denote one movement; on wger, 590 names resolved to 233 keys across 79 clusters. Synonymy is captured by construction rather than asserted. Second, </w:t>
+      </w:r>
+      <w:r>
+        <w:rPr>
+          <w:rFonts w:ascii="Georgia" w:cs="Georgia" w:eastAsia="Georgia" w:hAnsi="Georgia"/>
+          <w:b/>
+          <w:bCs/>
+          <w:color w:val="1a1a1a"/>
+          <w:sz w:val="21"/>
+          <w:szCs w:val="21"/>
+        </w:rPr>
+        <w:t xml:space="preserve">81%</w:t>
+      </w:r>
+      <w:r>
+        <w:rPr>
+          <w:rFonts w:ascii="Georgia" w:cs="Georgia" w:eastAsia="Georgia" w:hAnsi="Georgia"/>
+          <w:color w:val="1a1a1a"/>
+          <w:sz w:val="21"/>
+          <w:szCs w:val="21"/>
+        </w:rPr>
+        <w:t xml:space="preserve"> of the Free Exercise DB names did not state posture anywhere in the name or the record, so posture had to be supplied by the pattern default. The claim that existing exercise names are underspecified is therefore measurable, and it is the majority case.</w:t>
+      </w:r>
+    </w:p>
+    <w:p>
+      <w:pPr>
+        <w:pStyle w:val="Heading2"/>
+        <w:spacing w:after="100" w:before="220"/>
+      </w:pPr>
+      <w:r>
+        <w:rPr>
+          <w:rFonts w:ascii="Calibri" w:cs="Calibri" w:eastAsia="Calibri" w:hAnsi="Calibri"/>
+          <w:b/>
+          <w:bCs/>
+          <w:color w:val="1a1a1a"/>
+          <w:sz w:val="24"/>
+          <w:szCs w:val="24"/>
+        </w:rPr>
+        <w:t xml:space="preserve">9.4 Collision resistance and determinism</w:t>
+      </w:r>
+    </w:p>
+    <w:p>
+      <w:pPr>
+        <w:spacing w:after="140" w:line="276"/>
+        <w:jc w:val="both"/>
+      </w:pPr>
+      <w:r>
+        <w:rPr>
+          <w:rFonts w:ascii="Georgia" w:cs="Georgia" w:eastAsia="Georgia" w:hAnsi="Georgia"/>
+          <w:color w:val="1a1a1a"/>
+          <w:sz w:val="21"/>
+          <w:szCs w:val="21"/>
+        </w:rPr>
+        <w:t xml:space="preserve">Collision resistance was measured over a generated cross-product of the controlled vocabularies rather than argued from properties of the hash. Two sweeps were run: 5,821,200 records spanning every combination of posture, implement, pattern, laterality, angle, contraction and range, and a further 232,848 spanning grip orientation and width. Across </w:t>
+      </w:r>
+      <w:r>
+        <w:rPr>
+          <w:rFonts w:ascii="Georgia" w:cs="Georgia" w:eastAsia="Georgia" w:hAnsi="Georgia"/>
+          <w:b/>
+          <w:bCs/>
+          <w:color w:val="1a1a1a"/>
+          <w:sz w:val="21"/>
+          <w:szCs w:val="21"/>
+        </w:rPr>
+        <w:t xml:space="preserve">6,054,048 distinct canonical forms no two produced the same key.</w:t>
+      </w:r>
+      <w:r>
+        <w:rPr>
+          <w:rFonts w:ascii="Georgia" w:cs="Georgia" w:eastAsia="Georgia" w:hAnsi="Georgia"/>
+          <w:color w:val="1a1a1a"/>
+          <w:sz w:val="21"/>
+          <w:szCs w:val="21"/>
+        </w:rPr>
+        <w:t xml:space="preserve"> Determinism and independence from field order were confirmed over 20,000 randomly generated records.</w:t>
+      </w:r>
+    </w:p>
+    <w:tbl>
+      <w:tblPr>
+        <w:tblW w:type="dxa" w:w="9360"/>
+        <w:tblBorders>
+          <w:top w:val="single" w:color="cccccc" w:sz="4"/>
+          <w:left w:val="single" w:color="cccccc" w:sz="4"/>
+          <w:bottom w:val="single" w:color="cccccc" w:sz="4"/>
+          <w:right w:val="single" w:color="cccccc" w:sz="4"/>
+          <w:insideH w:val="single" w:color="cccccc" w:sz="2"/>
+          <w:insideV w:val="single" w:color="cccccc" w:sz="2"/>
+        </w:tblBorders>
+      </w:tblPr>
+      <w:tblGrid>
+        <w:gridCol w:w="4400"/>
+        <w:gridCol w:w="2480"/>
+        <w:gridCol w:w="2480"/>
+      </w:tblGrid>
+      <w:tr>
+        <w:trPr>
+          <w:tblHeader/>
+        </w:trPr>
+        <w:tc>
+          <w:tcPr>
+            <w:tcW w:type="dxa" w:w="4400"/>
+            <w:shd w:fill="6a2c91" w:val="clear"/>
+            <w:tcMar>
+              <w:top w:type="dxa" w:w="60"/>
+              <w:left w:type="dxa" w:w="90"/>
+              <w:bottom w:type="dxa" w:w="60"/>
+              <w:right w:type="dxa" w:w="90"/>
+            </w:tcMar>
+          </w:tcPr>
+          <w:p>
+            <w:r>
+              <w:rPr>
+                <w:rFonts w:ascii="Calibri" w:cs="Calibri" w:eastAsia="Calibri" w:hAnsi="Calibri"/>
+                <w:b/>
+                <w:bCs/>
+                <w:color w:val="ffffff"/>
+                <w:sz w:val="18"/>
+                <w:szCs w:val="18"/>
+              </w:rPr>
+              <w:t xml:space="preserve">Property tested</w:t>
+            </w:r>
+          </w:p>
+        </w:tc>
+        <w:tc>
+          <w:tcPr>
+            <w:tcW w:type="dxa" w:w="2480"/>
+            <w:shd w:fill="6a2c91" w:val="clear"/>
+            <w:tcMar>
+              <w:top w:type="dxa" w:w="60"/>
+              <w:left w:type="dxa" w:w="90"/>
+              <w:bottom w:type="dxa" w:w="60"/>
+              <w:right w:type="dxa" w:w="90"/>
+            </w:tcMar>
+          </w:tcPr>
+          <w:p>
+            <w:r>
+              <w:rPr>
+                <w:rFonts w:ascii="Calibri" w:cs="Calibri" w:eastAsia="Calibri" w:hAnsi="Calibri"/>
+                <w:b/>
+                <w:bCs/>
+                <w:color w:val="ffffff"/>
+                <w:sz w:val="18"/>
+                <w:szCs w:val="18"/>
+              </w:rPr>
+              <w:t xml:space="preserve">Records</w:t>
+            </w:r>
+          </w:p>
+        </w:tc>
+        <w:tc>
+          <w:tcPr>
+            <w:tcW w:type="dxa" w:w="2480"/>
+            <w:shd w:fill="6a2c91" w:val="clear"/>
+            <w:tcMar>
+              <w:top w:type="dxa" w:w="60"/>
+              <w:left w:type="dxa" w:w="90"/>
+              <w:bottom w:type="dxa" w:w="60"/>
+              <w:right w:type="dxa" w:w="90"/>
+            </w:tcMar>
+          </w:tcPr>
+          <w:p>
+            <w:r>
+              <w:rPr>
+                <w:rFonts w:ascii="Calibri" w:cs="Calibri" w:eastAsia="Calibri" w:hAnsi="Calibri"/>
+                <w:b/>
+                <w:bCs/>
+                <w:color w:val="ffffff"/>
+                <w:sz w:val="18"/>
+                <w:szCs w:val="18"/>
+              </w:rPr>
+              <w:t xml:space="preserve">Result</w:t>
+            </w:r>
+          </w:p>
+        </w:tc>
+      </w:tr>
+      <w:tr>
+        <w:tc>
+          <w:tcPr>
+            <w:tcW w:type="dxa" w:w="4400"/>
+            <w:shd w:fill="ffffff" w:val="clear"/>
+            <w:tcMar>
+              <w:top w:type="dxa" w:w="60"/>
+              <w:left w:type="dxa" w:w="90"/>
+              <w:bottom w:type="dxa" w:w="60"/>
+              <w:right w:type="dxa" w:w="90"/>
+            </w:tcMar>
+          </w:tcPr>
+          <w:p>
+            <w:r>
+              <w:rPr>
+                <w:rFonts w:ascii="Calibri" w:cs="Calibri" w:eastAsia="Calibri" w:hAnsi="Calibri"/>
+                <w:b w:val="false"/>
+                <w:bCs w:val="false"/>
+                <w:color w:val="1a1a1a"/>
+                <w:sz w:val="18"/>
+                <w:szCs w:val="18"/>
+              </w:rPr>
+              <w:t xml:space="preserve">Distinct canonical forms encoded</w:t>
+            </w:r>
+          </w:p>
+        </w:tc>
+        <w:tc>
+          <w:tcPr>
+            <w:tcW w:type="dxa" w:w="2480"/>
+            <w:shd w:fill="ffffff" w:val="clear"/>
+            <w:tcMar>
+              <w:top w:type="dxa" w:w="60"/>
+              <w:left w:type="dxa" w:w="90"/>
+              <w:bottom w:type="dxa" w:w="60"/>
+              <w:right w:type="dxa" w:w="90"/>
+            </w:tcMar>
+          </w:tcPr>
+          <w:p>
+            <w:r>
+              <w:rPr>
+                <w:rFonts w:ascii="Calibri" w:cs="Calibri" w:eastAsia="Calibri" w:hAnsi="Calibri"/>
+                <w:b w:val="false"/>
+                <w:bCs w:val="false"/>
+                <w:color w:val="1a1a1a"/>
+                <w:sz w:val="18"/>
+                <w:szCs w:val="18"/>
+              </w:rPr>
+              <w:t xml:space="preserve">6,054,048</w:t>
+            </w:r>
+          </w:p>
+        </w:tc>
+        <w:tc>
+          <w:tcPr>
+            <w:tcW w:type="dxa" w:w="2480"/>
+            <w:shd w:fill="ffffff" w:val="clear"/>
+            <w:tcMar>
+              <w:top w:type="dxa" w:w="60"/>
+              <w:left w:type="dxa" w:w="90"/>
+              <w:bottom w:type="dxa" w:w="60"/>
+              <w:right w:type="dxa" w:w="90"/>
+            </w:tcMar>
+          </w:tcPr>
+          <w:p>
+            <w:r>
+              <w:rPr>
+                <w:rFonts w:ascii="Calibri" w:cs="Calibri" w:eastAsia="Calibri" w:hAnsi="Calibri"/>
+                <w:b w:val="false"/>
+                <w:bCs w:val="false"/>
+                <w:color w:val="1a1a1a"/>
+                <w:sz w:val="18"/>
+                <w:szCs w:val="18"/>
+              </w:rPr>
+              <w:t xml:space="preserve">0 collisions</w:t>
+            </w:r>
+          </w:p>
+        </w:tc>
+      </w:tr>
+      <w:tr>
+        <w:tc>
+          <w:tcPr>
+            <w:tcW w:type="dxa" w:w="4400"/>
+            <w:shd w:fill="ffffff" w:val="clear"/>
+            <w:tcMar>
+              <w:top w:type="dxa" w:w="60"/>
+              <w:left w:type="dxa" w:w="90"/>
+              <w:bottom w:type="dxa" w:w="60"/>
+              <w:right w:type="dxa" w:w="90"/>
+            </w:tcMar>
+          </w:tcPr>
+          <w:p>
+            <w:r>
+              <w:rPr>
+                <w:rFonts w:ascii="Calibri" w:cs="Calibri" w:eastAsia="Calibri" w:hAnsi="Calibri"/>
+                <w:b w:val="false"/>
+                <w:bCs w:val="false"/>
+                <w:color w:val="1a1a1a"/>
+                <w:sz w:val="18"/>
+                <w:szCs w:val="18"/>
+              </w:rPr>
+              <w:t xml:space="preserve">Determinism (repeated encoding)</w:t>
+            </w:r>
+          </w:p>
+        </w:tc>
+        <w:tc>
+          <w:tcPr>
+            <w:tcW w:type="dxa" w:w="2480"/>
+            <w:shd w:fill="ffffff" w:val="clear"/>
+            <w:tcMar>
+              <w:top w:type="dxa" w:w="60"/>
+              <w:left w:type="dxa" w:w="90"/>
+              <w:bottom w:type="dxa" w:w="60"/>
+              <w:right w:type="dxa" w:w="90"/>
+            </w:tcMar>
+          </w:tcPr>
+          <w:p>
+            <w:r>
+              <w:rPr>
+                <w:rFonts w:ascii="Calibri" w:cs="Calibri" w:eastAsia="Calibri" w:hAnsi="Calibri"/>
+                <w:b w:val="false"/>
+                <w:bCs w:val="false"/>
+                <w:color w:val="1a1a1a"/>
+                <w:sz w:val="18"/>
+                <w:szCs w:val="18"/>
+              </w:rPr>
+              <w:t xml:space="preserve">20,000</w:t>
+            </w:r>
+          </w:p>
+        </w:tc>
+        <w:tc>
+          <w:tcPr>
+            <w:tcW w:type="dxa" w:w="2480"/>
+            <w:shd w:fill="ffffff" w:val="clear"/>
+            <w:tcMar>
+              <w:top w:type="dxa" w:w="60"/>
+              <w:left w:type="dxa" w:w="90"/>
+              <w:bottom w:type="dxa" w:w="60"/>
+              <w:right w:type="dxa" w:w="90"/>
+            </w:tcMar>
+          </w:tcPr>
+          <w:p>
+            <w:r>
+              <w:rPr>
+                <w:rFonts w:ascii="Calibri" w:cs="Calibri" w:eastAsia="Calibri" w:hAnsi="Calibri"/>
+                <w:b w:val="false"/>
+                <w:bCs w:val="false"/>
+                <w:color w:val="1a1a1a"/>
+                <w:sz w:val="18"/>
+                <w:szCs w:val="18"/>
+              </w:rPr>
+              <w:t xml:space="preserve">identical keys</w:t>
+            </w:r>
+          </w:p>
+        </w:tc>
+      </w:tr>
+      <w:tr>
+        <w:tc>
+          <w:tcPr>
+            <w:tcW w:type="dxa" w:w="4400"/>
+            <w:shd w:fill="ffffff" w:val="clear"/>
+            <w:tcMar>
+              <w:top w:type="dxa" w:w="60"/>
+              <w:left w:type="dxa" w:w="90"/>
+              <w:bottom w:type="dxa" w:w="60"/>
+              <w:right w:type="dxa" w:w="90"/>
+            </w:tcMar>
+          </w:tcPr>
+          <w:p>
+            <w:r>
+              <w:rPr>
+                <w:rFonts w:ascii="Calibri" w:cs="Calibri" w:eastAsia="Calibri" w:hAnsi="Calibri"/>
+                <w:b w:val="false"/>
+                <w:bCs w:val="false"/>
+                <w:color w:val="1a1a1a"/>
+                <w:sz w:val="18"/>
+                <w:szCs w:val="18"/>
+              </w:rPr>
+              <w:t xml:space="preserve">Independence from field order</w:t>
+            </w:r>
+          </w:p>
+        </w:tc>
+        <w:tc>
+          <w:tcPr>
+            <w:tcW w:type="dxa" w:w="2480"/>
+            <w:shd w:fill="ffffff" w:val="clear"/>
+            <w:tcMar>
+              <w:top w:type="dxa" w:w="60"/>
+              <w:left w:type="dxa" w:w="90"/>
+              <w:bottom w:type="dxa" w:w="60"/>
+              <w:right w:type="dxa" w:w="90"/>
+            </w:tcMar>
+          </w:tcPr>
+          <w:p>
+            <w:r>
+              <w:rPr>
+                <w:rFonts w:ascii="Calibri" w:cs="Calibri" w:eastAsia="Calibri" w:hAnsi="Calibri"/>
+                <w:b w:val="false"/>
+                <w:bCs w:val="false"/>
+                <w:color w:val="1a1a1a"/>
+                <w:sz w:val="18"/>
+                <w:szCs w:val="18"/>
+              </w:rPr>
+              <w:t xml:space="preserve">20,000</w:t>
+            </w:r>
+          </w:p>
+        </w:tc>
+        <w:tc>
+          <w:tcPr>
+            <w:tcW w:type="dxa" w:w="2480"/>
+            <w:shd w:fill="ffffff" w:val="clear"/>
+            <w:tcMar>
+              <w:top w:type="dxa" w:w="60"/>
+              <w:left w:type="dxa" w:w="90"/>
+              <w:bottom w:type="dxa" w:w="60"/>
+              <w:right w:type="dxa" w:w="90"/>
+            </w:tcMar>
+          </w:tcPr>
+          <w:p>
+            <w:r>
+              <w:rPr>
+                <w:rFonts w:ascii="Calibri" w:cs="Calibri" w:eastAsia="Calibri" w:hAnsi="Calibri"/>
+                <w:b w:val="false"/>
+                <w:bCs w:val="false"/>
+                <w:color w:val="1a1a1a"/>
+                <w:sz w:val="18"/>
+                <w:szCs w:val="18"/>
+              </w:rPr>
+              <w:t xml:space="preserve">identical keys</w:t>
+            </w:r>
+          </w:p>
+        </w:tc>
+      </w:tr>
+    </w:tbl>
+    <w:p>
+      <w:pPr>
+        <w:spacing w:after="180"/>
+      </w:pPr>
+      <w:r>
+        <w:rPr>
+          <w:rFonts w:ascii="Calibri" w:cs="Calibri" w:eastAsia="Calibri" w:hAnsi="Calibri"/>
+          <w:i/>
+          <w:iCs/>
+          <w:color w:val="5a5a5a"/>
+          <w:sz w:val="17"/>
+          <w:szCs w:val="17"/>
+        </w:rPr>
+        <w:t xml:space="preserve">Table 6. Collision and determinism sweep over the generated facet space.</w:t>
+      </w:r>
+    </w:p>
+    <w:p>
+      <w:pPr>
+        <w:pStyle w:val="Heading2"/>
+        <w:spacing w:after="100" w:before="220"/>
+      </w:pPr>
+      <w:r>
+        <w:rPr>
+          <w:rFonts w:ascii="Calibri" w:cs="Calibri" w:eastAsia="Calibri" w:hAnsi="Calibri"/>
+          <w:b/>
+          <w:bCs/>
+          <w:color w:val="1a1a1a"/>
+          <w:sz w:val="24"/>
+          <w:szCs w:val="24"/>
+        </w:rPr>
+        <w:t xml:space="preserve">9.5 Versioning demonstrated</w:t>
+      </w:r>
+    </w:p>
+    <w:p>
+      <w:pPr>
+        <w:spacing w:after="140" w:line="276"/>
+        <w:jc w:val="both"/>
+      </w:pPr>
+      <w:r>
+        <w:rPr>
+          <w:rFonts w:ascii="Georgia" w:cs="Georgia" w:eastAsia="Georgia" w:hAnsi="Georgia"/>
+          <w:color w:val="1a1a1a"/>
+          <w:sz w:val="21"/>
+          <w:szCs w:val="21"/>
+        </w:rPr>
+        <w:t xml:space="preserve">Because the key is a version prefix applied to a hash of the canonical string, and the canonical string does not itself contain the version, extending the vocabulary between editions changed every identifier's prefix and no identifier's hash. The bench press encoded as OMEN-0.1-VRQRJHQSX5NX6 under the earlier edition and encodes as OMEN-0.2-VRQRJHQSX5NX6 under this one. A consumer can therefore tell which edition minted a code and can recognise that the two denote the same movement, which is precisely the property Section 10 claims.</w:t>
+      </w:r>
+    </w:p>
+    <w:p>
+      <w:pPr>
+        <w:pStyle w:val="Heading2"/>
+        <w:spacing w:after="100" w:before="220"/>
+      </w:pPr>
+      <w:r>
+        <w:rPr>
+          <w:rFonts w:ascii="Calibri" w:cs="Calibri" w:eastAsia="Calibri" w:hAnsi="Calibri"/>
+          <w:b/>
+          <w:bCs/>
+          <w:color w:val="1a1a1a"/>
+          <w:sz w:val="24"/>
+          <w:szCs w:val="24"/>
+        </w:rPr>
+        <w:t xml:space="preserve">9.6 A crosswalk as the first usable artifact</w:t>
+      </w:r>
+    </w:p>
+    <w:p>
+      <w:pPr>
+        <w:spacing w:after="140" w:line="276"/>
+        <w:jc w:val="both"/>
+      </w:pPr>
+      <w:r>
+        <w:rPr>
+          <w:rFonts w:ascii="Georgia" w:cs="Georgia" w:eastAsia="Georgia" w:hAnsi="Georgia"/>
+          <w:color w:val="1a1a1a"/>
+          <w:sz w:val="21"/>
+          <w:szCs w:val="21"/>
+        </w:rPr>
+        <w:t xml:space="preserve">The audit produces something directly adoptable: a crosswalk mapping all 574 encodable Free Exercise DB records to their OMEN keys, canonical forms, facets and derived musculature, released as CSV and JSON. Any application already using that database can acquire stable identifiers by joining on it, without adopting the standard wholesale. We regard this, rather than the coverage percentage, as the most immediately useful output of the evaluation.</w:t>
+      </w:r>
+    </w:p>
+    <w:p>
+      <w:pPr>
+        <w:pStyle w:val="Heading1"/>
+        <w:spacing w:after="140" w:before="300"/>
+      </w:pPr>
+      <w:r>
+        <w:rPr>
+          <w:rFonts w:ascii="Calibri" w:cs="Calibri" w:eastAsia="Calibri" w:hAnsi="Calibri"/>
+          <w:b/>
+          <w:bCs/>
+          <w:color w:val="6a2c91"/>
+          <w:sz w:val="30"/>
+          <w:szCs w:val="30"/>
+        </w:rPr>
+        <w:t xml:space="preserve">10. Governance and Versioning</w:t>
       </w:r>
     </w:p>
     <w:p>
@@ -4602,68 +6799,16 @@
           <w:sz w:val="21"/>
           <w:szCs w:val="21"/>
         </w:rPr>
-        <w:t xml:space="preserve">Internationalization.</w:t>
-      </w:r>
-      <w:r>
-        <w:rPr>
-          <w:rFonts w:ascii="Georgia" w:cs="Georgia" w:eastAsia="Georgia" w:hAnsi="Georgia"/>
-          <w:color w:val="1a1a1a"/>
-          <w:sz w:val="21"/>
-          <w:szCs w:val="21"/>
-        </w:rPr>
-        <w:t xml:space="preserve"> Because identity is language-neutral, display names are a localizable layer: the registry can carry language reference sets so a single key renders in many languages without changing identity.</w:t>
-      </w:r>
-    </w:p>
-    <w:p>
-      <w:pPr>
-        <w:pStyle w:val="Heading1"/>
-        <w:spacing w:after="140" w:before="300"/>
-      </w:pPr>
-      <w:r>
-        <w:rPr>
-          <w:rFonts w:ascii="Calibri" w:cs="Calibri" w:eastAsia="Calibri" w:hAnsi="Calibri"/>
-          <w:b/>
-          <w:bCs/>
-          <w:color w:val="6a2c91"/>
-          <w:sz w:val="30"/>
-          <w:szCs w:val="30"/>
-        </w:rPr>
-        <w:t xml:space="preserve">10. Limitations and Future Work</w:t>
-      </w:r>
-    </w:p>
-    <w:p>
-      <w:pPr>
-        <w:spacing w:after="140" w:line="276"/>
-        <w:jc w:val="both"/>
-      </w:pPr>
-      <w:r>
-        <w:rPr>
-          <w:rFonts w:ascii="Georgia" w:cs="Georgia" w:eastAsia="Georgia" w:hAnsi="Georgia"/>
-          <w:color w:val="1a1a1a"/>
-          <w:sz w:val="21"/>
-          <w:szCs w:val="21"/>
-        </w:rPr>
-        <w:t xml:space="preserve">OMEN, as drafted, scopes itself deliberately to the </w:t>
-      </w:r>
-      <w:r>
-        <w:rPr>
-          <w:rFonts w:ascii="Georgia" w:cs="Georgia" w:eastAsia="Georgia" w:hAnsi="Georgia"/>
-          <w:i/>
-          <w:iCs/>
-          <w:color w:val="1a1a1a"/>
-          <w:sz w:val="21"/>
-          <w:szCs w:val="21"/>
-        </w:rPr>
-        <w:t xml:space="preserve">identity of a resistance-training movement.</w:t>
-      </w:r>
-      <w:r>
-        <w:rPr>
-          <w:rFonts w:ascii="Georgia" w:cs="Georgia" w:eastAsia="Georgia" w:hAnsi="Georgia"/>
-          <w:color w:val="1a1a1a"/>
-          <w:sz w:val="21"/>
-          <w:szCs w:val="21"/>
-        </w:rPr>
-        <w:t xml:space="preserve"> Several boundaries and extensions follow.</w:t>
+        <w:t xml:space="preserve">A registry needs a first artifact.</w:t>
+      </w:r>
+      <w:r>
+        <w:rPr>
+          <w:rFonts w:ascii="Georgia" w:cs="Georgia" w:eastAsia="Georgia" w:hAnsi="Georgia"/>
+          <w:color w:val="1a1a1a"/>
+          <w:sz w:val="21"/>
+          <w:szCs w:val="21"/>
+        </w:rPr>
+        <w:t xml:space="preserve"> A governance model with nothing to govern does not attract adopters. The crosswalk of Section 9.6 is offered as that first artifact: a concrete, versioned mapping between an existing database and the standard, the smallest useful thing a registry can publish.</w:t>
       </w:r>
     </w:p>
     <w:p>
@@ -4684,16 +6829,48 @@
           <w:sz w:val="21"/>
           <w:szCs w:val="21"/>
         </w:rPr>
-        <w:t xml:space="preserve">Dosage is a separate layer.</w:t>
-      </w:r>
-      <w:r>
-        <w:rPr>
-          <w:rFonts w:ascii="Georgia" w:cs="Georgia" w:eastAsia="Georgia" w:hAnsi="Georgia"/>
-          <w:color w:val="1a1a1a"/>
-          <w:sz w:val="21"/>
-          <w:szCs w:val="21"/>
-        </w:rPr>
-        <w:t xml:space="preserve"> How a movement is </w:t>
+        <w:t xml:space="preserve">Internationalization.</w:t>
+      </w:r>
+      <w:r>
+        <w:rPr>
+          <w:rFonts w:ascii="Georgia" w:cs="Georgia" w:eastAsia="Georgia" w:hAnsi="Georgia"/>
+          <w:color w:val="1a1a1a"/>
+          <w:sz w:val="21"/>
+          <w:szCs w:val="21"/>
+        </w:rPr>
+        <w:t xml:space="preserve"> Because identity is language-neutral, display names are a localizable layer: the registry can carry language reference sets so a single key renders in many languages without changing identity.</w:t>
+      </w:r>
+    </w:p>
+    <w:p>
+      <w:pPr>
+        <w:pStyle w:val="Heading1"/>
+        <w:spacing w:after="140" w:before="300"/>
+      </w:pPr>
+      <w:r>
+        <w:rPr>
+          <w:rFonts w:ascii="Calibri" w:cs="Calibri" w:eastAsia="Calibri" w:hAnsi="Calibri"/>
+          <w:b/>
+          <w:bCs/>
+          <w:color w:val="6a2c91"/>
+          <w:sz w:val="30"/>
+          <w:szCs w:val="30"/>
+        </w:rPr>
+        <w:t xml:space="preserve">11. Limitations and Future Work</w:t>
+      </w:r>
+    </w:p>
+    <w:p>
+      <w:pPr>
+        <w:spacing w:after="140" w:line="276"/>
+        <w:jc w:val="both"/>
+      </w:pPr>
+      <w:r>
+        <w:rPr>
+          <w:rFonts w:ascii="Georgia" w:cs="Georgia" w:eastAsia="Georgia" w:hAnsi="Georgia"/>
+          <w:color w:val="1a1a1a"/>
+          <w:sz w:val="21"/>
+          <w:szCs w:val="21"/>
+        </w:rPr>
+        <w:t xml:space="preserve">OMEN, as drafted, scopes itself deliberately to the </w:t>
       </w:r>
       <w:r>
         <w:rPr>
@@ -4704,16 +6881,16 @@
           <w:sz w:val="21"/>
           <w:szCs w:val="21"/>
         </w:rPr>
-        <w:t xml:space="preserve">performed in a session</w:t>
-      </w:r>
-      <w:r>
-        <w:rPr>
-          <w:rFonts w:ascii="Georgia" w:cs="Georgia" w:eastAsia="Georgia" w:hAnsi="Georgia"/>
-          <w:color w:val="1a1a1a"/>
-          <w:sz w:val="21"/>
-          <w:szCs w:val="21"/>
-        </w:rPr>
-        <w:t xml:space="preserve"> (load, sets, repetitions, rest, tempo prescription) is a distinct standardization problem. OMEN names the movement; a companion dosage notation should reference OMEN keys rather than fold into them.</w:t>
+        <w:t xml:space="preserve">identity of a resistance-training movement.</w:t>
+      </w:r>
+      <w:r>
+        <w:rPr>
+          <w:rFonts w:ascii="Georgia" w:cs="Georgia" w:eastAsia="Georgia" w:hAnsi="Georgia"/>
+          <w:color w:val="1a1a1a"/>
+          <w:sz w:val="21"/>
+          <w:szCs w:val="21"/>
+        </w:rPr>
+        <w:t xml:space="preserve"> Several boundaries and extensions follow.</w:t>
       </w:r>
     </w:p>
     <w:p>
@@ -4734,16 +6911,36 @@
           <w:sz w:val="21"/>
           <w:szCs w:val="21"/>
         </w:rPr>
-        <w:t xml:space="preserve">Beyond resistance training.</w:t>
-      </w:r>
-      <w:r>
-        <w:rPr>
-          <w:rFonts w:ascii="Georgia" w:cs="Georgia" w:eastAsia="Georgia" w:hAnsi="Georgia"/>
-          <w:color w:val="1a1a1a"/>
-          <w:sz w:val="21"/>
-          <w:szCs w:val="21"/>
-        </w:rPr>
-        <w:t xml:space="preserve"> Cardiovascular, mobility, sport-specific, and rehabilitation movements are out of scope for version 0.1. The facet approach should extend to them, but each brings axes (duration, intensity zones, sport context) that need their own vocabularies.</w:t>
+        <w:t xml:space="preserve">Dosage is a separate layer.</w:t>
+      </w:r>
+      <w:r>
+        <w:rPr>
+          <w:rFonts w:ascii="Georgia" w:cs="Georgia" w:eastAsia="Georgia" w:hAnsi="Georgia"/>
+          <w:color w:val="1a1a1a"/>
+          <w:sz w:val="21"/>
+          <w:szCs w:val="21"/>
+        </w:rPr>
+        <w:t xml:space="preserve"> How a movement is </w:t>
+      </w:r>
+      <w:r>
+        <w:rPr>
+          <w:rFonts w:ascii="Georgia" w:cs="Georgia" w:eastAsia="Georgia" w:hAnsi="Georgia"/>
+          <w:i/>
+          <w:iCs/>
+          <w:color w:val="1a1a1a"/>
+          <w:sz w:val="21"/>
+          <w:szCs w:val="21"/>
+        </w:rPr>
+        <w:t xml:space="preserve">performed in a session</w:t>
+      </w:r>
+      <w:r>
+        <w:rPr>
+          <w:rFonts w:ascii="Georgia" w:cs="Georgia" w:eastAsia="Georgia" w:hAnsi="Georgia"/>
+          <w:color w:val="1a1a1a"/>
+          <w:sz w:val="21"/>
+          <w:szCs w:val="21"/>
+        </w:rPr>
+        <w:t xml:space="preserve"> (load, sets, repetitions, rest, tempo prescription) is a distinct standardization problem. OMEN names the movement; a companion dosage notation should reference OMEN keys rather than fold into them.</w:t>
       </w:r>
     </w:p>
     <w:p>
@@ -4764,16 +6961,16 @@
           <w:sz w:val="21"/>
           <w:szCs w:val="21"/>
         </w:rPr>
-        <w:t xml:space="preserve">Granularity of muscle and pattern.</w:t>
-      </w:r>
-      <w:r>
-        <w:rPr>
-          <w:rFonts w:ascii="Georgia" w:cs="Georgia" w:eastAsia="Georgia" w:hAnsi="Georgia"/>
-          <w:color w:val="1a1a1a"/>
-          <w:sz w:val="21"/>
-          <w:szCs w:val="21"/>
-        </w:rPr>
-        <w:t xml:space="preserve"> The pattern-to-muscle table is intentionally coarse; linking it to a formal anatomical ontology and allowing finer variants (for example, a curl biased to the brachialis) is future work.</w:t>
+        <w:t xml:space="preserve">Beyond resistance training.</w:t>
+      </w:r>
+      <w:r>
+        <w:rPr>
+          <w:rFonts w:ascii="Georgia" w:cs="Georgia" w:eastAsia="Georgia" w:hAnsi="Georgia"/>
+          <w:color w:val="1a1a1a"/>
+          <w:sz w:val="21"/>
+          <w:szCs w:val="21"/>
+        </w:rPr>
+        <w:t xml:space="preserve"> Cardiovascular, mobility, sport-specific, and rehabilitation movements are out of scope for version 0.2. The facet approach should extend to them, but each brings axes (duration, intensity zones, sport context) that need their own vocabularies.</w:t>
       </w:r>
     </w:p>
     <w:p>
@@ -4794,16 +6991,166 @@
           <w:sz w:val="21"/>
           <w:szCs w:val="21"/>
         </w:rPr>
-        <w:t xml:space="preserve">Empirical validation is pending.</w:t>
-      </w:r>
-      <w:r>
-        <w:rPr>
-          <w:rFonts w:ascii="Georgia" w:cs="Georgia" w:eastAsia="Georgia" w:hAnsi="Georgia"/>
-          <w:color w:val="1a1a1a"/>
-          <w:sz w:val="21"/>
-          <w:szCs w:val="21"/>
-        </w:rPr>
-        <w:t xml:space="preserve"> The evaluation of Section 8 is a design, not yet a result. The inter-annotator study in particular must be run before OMEN can claim the reproducibility it is built for.</w:t>
+        <w:t xml:space="preserve">Granularity of muscle and pattern.</w:t>
+      </w:r>
+      <w:r>
+        <w:rPr>
+          <w:rFonts w:ascii="Georgia" w:cs="Georgia" w:eastAsia="Georgia" w:hAnsi="Georgia"/>
+          <w:color w:val="1a1a1a"/>
+          <w:sz w:val="21"/>
+          <w:szCs w:val="21"/>
+        </w:rPr>
+        <w:t xml:space="preserve"> The pattern-to-muscle table is intentionally coarse; linking it to a formal anatomical ontology and allowing finer variants (for example, a curl biased to the brachialis) is future work.</w:t>
+      </w:r>
+    </w:p>
+    <w:p>
+      <w:pPr>
+        <w:pStyle w:val="ListParagraph"/>
+        <w:numPr>
+          <w:ilvl w:val="0"/>
+          <w:numId w:val="1"/>
+        </w:numPr>
+        <w:spacing w:after="90" w:line="268"/>
+      </w:pPr>
+      <w:r>
+        <w:rPr>
+          <w:rFonts w:ascii="Georgia" w:cs="Georgia" w:eastAsia="Georgia" w:hAnsi="Georgia"/>
+          <w:b/>
+          <w:bCs/>
+          <w:color w:val="1a1a1a"/>
+          <w:sz w:val="21"/>
+          <w:szCs w:val="21"/>
+        </w:rPr>
+        <w:t xml:space="preserve">Inter-annotator agreement is not yet measured.</w:t>
+      </w:r>
+      <w:r>
+        <w:rPr>
+          <w:rFonts w:ascii="Georgia" w:cs="Georgia" w:eastAsia="Georgia" w:hAnsi="Georgia"/>
+          <w:color w:val="1a1a1a"/>
+          <w:sz w:val="21"/>
+          <w:szCs w:val="21"/>
+        </w:rPr>
+        <w:t xml:space="preserve"> Section 9 reports coverage, synonymy, collision resistance and determinism, all of which a machine can measure. The central claim of any naming standard, that independent trained humans encode the same movement identically, requires annotators and has not been run. The full study materials (instructions, a 30-movement set, a response template, and a scoring script computing exact-key agreement and per-facet Fleiss' kappa) are released with the standard so others can run it, but until results exist OMEN's reproducibility is demonstrated for the encoder and not for its users.</w:t>
+      </w:r>
+    </w:p>
+    <w:p>
+      <w:pPr>
+        <w:pStyle w:val="ListParagraph"/>
+        <w:numPr>
+          <w:ilvl w:val="0"/>
+          <w:numId w:val="1"/>
+        </w:numPr>
+        <w:spacing w:after="90" w:line="268"/>
+      </w:pPr>
+      <w:r>
+        <w:rPr>
+          <w:rFonts w:ascii="Georgia" w:cs="Georgia" w:eastAsia="Georgia" w:hAnsi="Georgia"/>
+          <w:b/>
+          <w:bCs/>
+          <w:color w:val="1a1a1a"/>
+          <w:sz w:val="21"/>
+          <w:szCs w:val="21"/>
+        </w:rPr>
+        <w:t xml:space="preserve">The coverage audit is automated.</w:t>
+      </w:r>
+      <w:r>
+        <w:rPr>
+          <w:rFonts w:ascii="Georgia" w:cs="Georgia" w:eastAsia="Georgia" w:hAnsi="Georgia"/>
+          <w:color w:val="1a1a1a"/>
+          <w:sz w:val="21"/>
+          <w:szCs w:val="21"/>
+        </w:rPr>
+        <w:t xml:space="preserve"> Records were mapped to facets by script rather than by expert annotators, which is a proxy for manual encoding and not a substitute for it. Two mitigations are released: the mapping heuristics are published so the figure can be reproduced and contested, and a fixed-seed 50-record sample with a comparison script is provided so a human encoder can measure how far the automated mapping departs from their judgement.</w:t>
+      </w:r>
+    </w:p>
+    <w:p>
+      <w:pPr>
+        <w:pStyle w:val="ListParagraph"/>
+        <w:numPr>
+          <w:ilvl w:val="0"/>
+          <w:numId w:val="1"/>
+        </w:numPr>
+        <w:spacing w:after="90" w:line="268"/>
+      </w:pPr>
+      <w:r>
+        <w:rPr>
+          <w:rFonts w:ascii="Georgia" w:cs="Georgia" w:eastAsia="Georgia" w:hAnsi="Georgia"/>
+          <w:b/>
+          <w:bCs/>
+          <w:color w:val="1a1a1a"/>
+          <w:sz w:val="21"/>
+          <w:szCs w:val="21"/>
+        </w:rPr>
+        <w:t xml:space="preserve">Multi-phase movements are out of scope.</w:t>
+      </w:r>
+      <w:r>
+        <w:rPr>
+          <w:rFonts w:ascii="Georgia" w:cs="Georgia" w:eastAsia="Georgia" w:hAnsi="Georgia"/>
+          <w:color w:val="1a1a1a"/>
+          <w:sz w:val="21"/>
+          <w:szCs w:val="21"/>
+        </w:rPr>
+        <w:t xml:space="preserve"> As Section 9.2 reports, essentially the entire residual gap in both corpora is the Olympic lifts and similar composite movements. OMEN names a single movement pattern; a clean is a sequence. A composite notation referencing OMEN keys is the main open design question.</w:t>
+      </w:r>
+    </w:p>
+    <w:p>
+      <w:pPr>
+        <w:pStyle w:val="ListParagraph"/>
+        <w:numPr>
+          <w:ilvl w:val="0"/>
+          <w:numId w:val="1"/>
+        </w:numPr>
+        <w:spacing w:after="90" w:line="268"/>
+      </w:pPr>
+      <w:r>
+        <w:rPr>
+          <w:rFonts w:ascii="Georgia" w:cs="Georgia" w:eastAsia="Georgia" w:hAnsi="Georgia"/>
+          <w:b/>
+          <w:bCs/>
+          <w:color w:val="1a1a1a"/>
+          <w:sz w:val="21"/>
+          <w:szCs w:val="21"/>
+        </w:rPr>
+        <w:t xml:space="preserve">The provenance of the vocabularies is uneven.</w:t>
+      </w:r>
+      <w:r>
+        <w:rPr>
+          <w:rFonts w:ascii="Georgia" w:cs="Georgia" w:eastAsia="Georgia" w:hAnsi="Georgia"/>
+          <w:color w:val="1a1a1a"/>
+          <w:sz w:val="21"/>
+          <w:szCs w:val="21"/>
+        </w:rPr>
+        <w:t xml:space="preserve"> The joint-action patterns follow standard anatomical terminology of motion. The higher-level patterns (squat, hinge, lunge, carry) follow the movement-pattern taxonomy widely used in strength and conditioning practice, which is practitioner convention rather than a peer-reviewed classification; OMEN makes it explicit and testable rather than claiming to derive it. The pattern-to-muscle table encodes conventional textbook attributions and is deliberately coarse: it is not a systematic review of electromyographic evidence and should be read as a defensible default rather than a finding. Binding muscle terms to a formal anatomy ontology such as the Foundational Model of Anatomy (Rosse &amp; Mejino, 2003) is future work.</w:t>
+      </w:r>
+    </w:p>
+    <w:p>
+      <w:pPr>
+        <w:pStyle w:val="ListParagraph"/>
+        <w:numPr>
+          <w:ilvl w:val="0"/>
+          <w:numId w:val="1"/>
+        </w:numPr>
+        <w:spacing w:after="90" w:line="268"/>
+      </w:pPr>
+      <w:r>
+        <w:rPr>
+          <w:rFonts w:ascii="Georgia" w:cs="Georgia" w:eastAsia="Georgia" w:hAnsi="Georgia"/>
+          <w:b/>
+          <w:bCs/>
+          <w:color w:val="1a1a1a"/>
+          <w:sz w:val="21"/>
+          <w:szCs w:val="21"/>
+        </w:rPr>
+        <w:t xml:space="preserve">Two corpora, both community-built.</w:t>
+      </w:r>
+      <w:r>
+        <w:rPr>
+          <w:rFonts w:ascii="Georgia" w:cs="Georgia" w:eastAsia="Georgia" w:hAnsi="Georgia"/>
+          <w:color w:val="1a1a1a"/>
+          <w:sz w:val="21"/>
+          <w:szCs w:val="21"/>
+        </w:rPr>
+        <w:t xml:space="preserve"> Coverage is reported against two open exercise databases. Neither is a sample of exercise names as they appear in the research literature, which is where the inconsistency was originally documented (Nuzzo, 2021). Auditing a corpus of published article titles would test whether these figures generalise to scientific writing.</w:t>
       </w:r>
     </w:p>
     <w:p>
@@ -4820,7 +7167,7 @@
           <w:sz w:val="30"/>
           <w:szCs w:val="30"/>
         </w:rPr>
-        <w:t xml:space="preserve">11. Conclusion</w:t>
+        <w:t xml:space="preserve">12. Conclusion</w:t>
       </w:r>
     </w:p>
     <w:p>
@@ -4835,7 +7182,7 @@
           <w:sz w:val="21"/>
           <w:szCs w:val="21"/>
         </w:rPr>
-        <w:t xml:space="preserve">Exercise naming is inconsistent, the inconsistency has a measurable cost, and the professionals affected want it fixed, all of which is established, not conjectured. What has been missing is a standard that is computable rather than merely recommended: one that fixes a vocabulary and an identifier, not just a word order. OMEN supplies that by describing a movement as orthogonal facets, deriving its musculature from its movement pattern, and generating a canonical form and a stable, versioned key while keeping human names as a curated layer. It unifies the strengths of the three prior camps (the practitioner call for standardization, the database instinct to decompose into fields, and the ontological commitment to controlled terms and open publication) into the interoperable key the field currently lacks. The reference implementation makes the standard executable today; the evaluation protocol makes it falsifiable; the governance model makes it able to grow. The next step is empirical: run the inter-annotator study and the coverage audit, and let the results drive version 1.0.</w:t>
+        <w:t xml:space="preserve">Exercise naming is inconsistent, the inconsistency has a measurable cost, and the professionals affected want it fixed, all of which is established, not conjectured. What has been missing is a standard that is computable rather than merely recommended: one that fixes a vocabulary and an identifier, not just a word order. OMEN supplies that by describing a movement as orthogonal facets, deriving its musculature from its movement pattern, and generating a canonical form and a stable, versioned key while keeping human names as a curated layer. It unifies the strengths of the three prior camps (the practitioner call for standardization, the database instinct to decompose into fields, and the ontological commitment to controlled terms and open publication) into the interoperable key the field currently lacks. The reference implementation makes the standard executable today; the coverage audit and the collision sweep reported in Section 9 make it measurable; the governance model makes it able to grow. Three quarters of an independent database encodes without invention, the gaps are enumerable rather than open-ended, and the identifier survives two and a half million records without a collision. The step that remains is the one only people can supply: the inter-annotator study that will show whether trained humans, and not merely the encoder, apply the standard the same way.</w:t>
       </w:r>
     </w:p>
     <w:p>
@@ -4852,6 +7199,192 @@
           <w:sz w:val="30"/>
           <w:szCs w:val="30"/>
         </w:rPr>
+        <w:t xml:space="preserve">Data and Code Availability</w:t>
+      </w:r>
+    </w:p>
+    <w:p>
+      <w:pPr>
+        <w:spacing w:after="140" w:line="276"/>
+        <w:jc w:val="both"/>
+      </w:pPr>
+      <w:r>
+        <w:rPr>
+          <w:rFonts w:ascii="Georgia" w:cs="Georgia" w:eastAsia="Georgia" w:hAnsi="Georgia"/>
+          <w:color w:val="1a1a1a"/>
+          <w:sz w:val="21"/>
+          <w:szCs w:val="21"/>
+        </w:rPr>
+        <w:t xml:space="preserve">The OMEN reference encoder, its test suite (18 tests, all passing), the coverage-audit and collision-sweep scripts, and the machine-readable controlled vocabularies are released under an open licence at the project repository. The corpora audited in Section 9 are the public-domain Free Exercise DB and the open wger exercise database. The crosswalk (CSV and JSON), the inter-annotator study materials, and the manual-validation sample are released in the same repository. All figures reported here regenerate from the released scripts.</w:t>
+      </w:r>
+    </w:p>
+    <w:p>
+      <w:pPr>
+        <w:spacing w:after="140" w:line="276"/>
+        <w:jc w:val="both"/>
+      </w:pPr>
+      <w:r>
+        <w:rPr>
+          <w:rFonts w:ascii="Georgia" w:cs="Georgia" w:eastAsia="Georgia" w:hAnsi="Georgia"/>
+          <w:b/>
+          <w:bCs/>
+          <w:color w:val="1a1a1a"/>
+          <w:sz w:val="21"/>
+          <w:szCs w:val="21"/>
+        </w:rPr>
+        <w:t xml:space="preserve">Repository:</w:t>
+      </w:r>
+      <w:r>
+        <w:rPr>
+          <w:rFonts w:ascii="Georgia" w:cs="Georgia" w:eastAsia="Georgia" w:hAnsi="Georgia"/>
+          <w:color w:val="1a1a1a"/>
+          <w:sz w:val="21"/>
+          <w:szCs w:val="21"/>
+        </w:rPr>
+        <w:t xml:space="preserve"> https://github.com/AbleVLabs/omen</w:t>
+      </w:r>
+    </w:p>
+    <w:p>
+      <w:pPr>
+        <w:pStyle w:val="Heading1"/>
+        <w:spacing w:after="140" w:before="300"/>
+      </w:pPr>
+      <w:r>
+        <w:rPr>
+          <w:rFonts w:ascii="Calibri" w:cs="Calibri" w:eastAsia="Calibri" w:hAnsi="Calibri"/>
+          <w:b/>
+          <w:bCs/>
+          <w:color w:val="6a2c91"/>
+          <w:sz w:val="30"/>
+          <w:szCs w:val="30"/>
+        </w:rPr>
+        <w:t xml:space="preserve">Author Contributions</w:t>
+      </w:r>
+    </w:p>
+    <w:p>
+      <w:pPr>
+        <w:spacing w:after="140" w:line="276"/>
+        <w:jc w:val="both"/>
+      </w:pPr>
+      <w:r>
+        <w:rPr>
+          <w:rFonts w:ascii="Georgia" w:cs="Georgia" w:eastAsia="Georgia" w:hAnsi="Georgia"/>
+          <w:color w:val="1a1a1a"/>
+          <w:sz w:val="21"/>
+          <w:szCs w:val="21"/>
+        </w:rPr>
+        <w:t xml:space="preserve">C.A.V. is the sole author. He conceived and directed the project, specified and approved the design of the standard, verified the results reported in Section 9 by independently re-running the released audit scripts, and reviewed and approved the final manuscript.</w:t>
+      </w:r>
+    </w:p>
+    <w:p>
+      <w:pPr>
+        <w:pStyle w:val="Heading1"/>
+        <w:spacing w:after="140" w:before="300"/>
+      </w:pPr>
+      <w:r>
+        <w:rPr>
+          <w:rFonts w:ascii="Calibri" w:cs="Calibri" w:eastAsia="Calibri" w:hAnsi="Calibri"/>
+          <w:b/>
+          <w:bCs/>
+          <w:color w:val="6a2c91"/>
+          <w:sz w:val="30"/>
+          <w:szCs w:val="30"/>
+        </w:rPr>
+        <w:t xml:space="preserve">Use of Generative AI</w:t>
+      </w:r>
+    </w:p>
+    <w:p>
+      <w:pPr>
+        <w:spacing w:after="140" w:line="276"/>
+        <w:jc w:val="both"/>
+      </w:pPr>
+      <w:r>
+        <w:rPr>
+          <w:rFonts w:ascii="Georgia" w:cs="Georgia" w:eastAsia="Georgia" w:hAnsi="Georgia"/>
+          <w:color w:val="1a1a1a"/>
+          <w:sz w:val="21"/>
+          <w:szCs w:val="21"/>
+        </w:rPr>
+        <w:t xml:space="preserve">The author used Anthropic's Claude, a generative AI assistant, throughout this project. AI assistance was used to survey prior work, draft and revise the manuscript, implement the reference encoder and its test suite, generate Figures 1 and 2, and execute the coverage audit and collision sweep reported in Section 9. The author directed the project, reviewed and approved all design decisions, independently reproduced the reported results using the released scripts, and takes full responsibility for the content of this manuscript.</w:t>
+      </w:r>
+    </w:p>
+    <w:p>
+      <w:pPr>
+        <w:pStyle w:val="Heading1"/>
+        <w:spacing w:after="140" w:before="300"/>
+      </w:pPr>
+      <w:r>
+        <w:rPr>
+          <w:rFonts w:ascii="Calibri" w:cs="Calibri" w:eastAsia="Calibri" w:hAnsi="Calibri"/>
+          <w:b/>
+          <w:bCs/>
+          <w:color w:val="6a2c91"/>
+          <w:sz w:val="30"/>
+          <w:szCs w:val="30"/>
+        </w:rPr>
+        <w:t xml:space="preserve">Funding</w:t>
+      </w:r>
+    </w:p>
+    <w:p>
+      <w:pPr>
+        <w:spacing w:after="140" w:line="276"/>
+        <w:jc w:val="both"/>
+      </w:pPr>
+      <w:r>
+        <w:rPr>
+          <w:rFonts w:ascii="Georgia" w:cs="Georgia" w:eastAsia="Georgia" w:hAnsi="Georgia"/>
+          <w:color w:val="1a1a1a"/>
+          <w:sz w:val="21"/>
+          <w:szCs w:val="21"/>
+        </w:rPr>
+        <w:t xml:space="preserve">This work received no external funding.</w:t>
+      </w:r>
+    </w:p>
+    <w:p>
+      <w:pPr>
+        <w:pStyle w:val="Heading1"/>
+        <w:spacing w:after="140" w:before="300"/>
+      </w:pPr>
+      <w:r>
+        <w:rPr>
+          <w:rFonts w:ascii="Calibri" w:cs="Calibri" w:eastAsia="Calibri" w:hAnsi="Calibri"/>
+          <w:b/>
+          <w:bCs/>
+          <w:color w:val="6a2c91"/>
+          <w:sz w:val="30"/>
+          <w:szCs w:val="30"/>
+        </w:rPr>
+        <w:t xml:space="preserve">Conflicts of Interest</w:t>
+      </w:r>
+    </w:p>
+    <w:p>
+      <w:pPr>
+        <w:spacing w:after="140" w:line="276"/>
+        <w:jc w:val="both"/>
+      </w:pPr>
+      <w:r>
+        <w:rPr>
+          <w:rFonts w:ascii="Georgia" w:cs="Georgia" w:eastAsia="Georgia" w:hAnsi="Georgia"/>
+          <w:color w:val="1a1a1a"/>
+          <w:sz w:val="21"/>
+          <w:szCs w:val="21"/>
+        </w:rPr>
+        <w:t xml:space="preserve">The author declares no competing interests.</w:t>
+      </w:r>
+    </w:p>
+    <w:p>
+      <w:pPr>
+        <w:pStyle w:val="Heading1"/>
+        <w:spacing w:after="140" w:before="300"/>
+      </w:pPr>
+      <w:r>
+        <w:rPr>
+          <w:rFonts w:ascii="Calibri" w:cs="Calibri" w:eastAsia="Calibri" w:hAnsi="Calibri"/>
+          <w:b/>
+          <w:bCs/>
+          <w:color w:val="6a2c91"/>
+          <w:sz w:val="30"/>
+          <w:szCs w:val="30"/>
+        </w:rPr>
         <w:t xml:space="preserve">References</w:t>
       </w:r>
     </w:p>
@@ -4867,7 +7400,7 @@
           <w:sz w:val="19"/>
           <w:szCs w:val="19"/>
         </w:rPr>
-        <w:t xml:space="preserve">Jackson, M. C., Brown, L. E., Coburn, J. W., Judelson, D. A., &amp; Cullen-Carroll, N. (2013). Towards Standardization of the Nomenclature of Resistance Training Exercises. Journal of Strength and Conditioning Research, 27(5), 1441–1449.</w:t>
+        <w:t xml:space="preserve">Jackson, M. C., Brown, L. E., Coburn, J. W., Judelson, D. A., &amp; Cullen-Carroll, N. (2013). Towards standardization of the nomenclature of resistance training exercises. Journal of Strength and Conditioning Research, 27(5), 1441-1449. doi:10.1519/JSC.0b013e318289168d</w:t>
       </w:r>
     </w:p>
     <w:p>
@@ -4882,7 +7415,7 @@
           <w:sz w:val="19"/>
           <w:szCs w:val="19"/>
         </w:rPr>
-        <w:t xml:space="preserve">Nuzzo, J. L. (2017). Words and Patterns That Comprise Resistance Training Exercise Names. Journal of Strength and Conditioning Research, 31(3), 826–830.</w:t>
+        <w:t xml:space="preserve">Nuzzo, J. L. (2017). Words and patterns that comprise resistance training exercise names. Journal of Strength and Conditioning Research, 31(3), 826-830. doi:10.1519/JSC.0000000000000965</w:t>
       </w:r>
     </w:p>
     <w:p>
@@ -4897,7 +7430,7 @@
           <w:sz w:val="19"/>
           <w:szCs w:val="19"/>
         </w:rPr>
-        <w:t xml:space="preserve">Nuzzo, J. L. (2021). Inconsistent Use of Resistance Exercise Names in Research Articles: A Brief Note. (PMC8608004.)</w:t>
+        <w:t xml:space="preserve">Nuzzo, J. L. (2021). Inconsistent use of resistance exercise names in research articles: a brief note. Journal of Strength and Conditioning Research, 35(12), 3518-3520. doi:10.1519/JSC.0000000000004083</w:t>
       </w:r>
     </w:p>
     <w:p>
@@ -4912,7 +7445,7 @@
           <w:sz w:val="19"/>
           <w:szCs w:val="19"/>
         </w:rPr>
-        <w:t xml:space="preserve">Eccentric Muscle Actions Add Complexity to an Already Inconsistent Resistance Exercise Nomenclature. (2023). Sports Medicine – Open. doi:10.1186/s40798-023-00667-4.</w:t>
+        <w:t xml:space="preserve">Nuzzo, J. L., &amp; Nosaka, K. (2023). Eccentric muscle actions add complexity to an already inconsistent resistance exercise nomenclature. Sports Medicine - Open, 9, 118. doi:10.1186/s40798-023-00667-4</w:t>
       </w:r>
     </w:p>
     <w:p>
@@ -4927,7 +7460,7 @@
           <w:sz w:val="19"/>
           <w:szCs w:val="19"/>
         </w:rPr>
-        <w:t xml:space="preserve">Developing a Physical Activity Ontology to Support the Interoperability of Physical Activity Data (PACO). (2019). Journal of Medical Internet Research, 21(4), e12776.</w:t>
+        <w:t xml:space="preserve">Kim, H., Mentzer, J., &amp; Taira, R. (2019). Developing a physical activity ontology to support the interoperability of physical activity data. Journal of Medical Internet Research, 21(4), e12776. doi:10.2196/12776</w:t>
       </w:r>
     </w:p>
     <w:p>
@@ -4942,7 +7475,7 @@
           <w:sz w:val="19"/>
           <w:szCs w:val="19"/>
         </w:rPr>
-        <w:t xml:space="preserve">Core reference ontology for individualized exercise prescription (Exercise Medicine Ontology). (2024). Scientific Data. doi:10.1038/s41597-024-04217-9.</w:t>
+        <w:t xml:space="preserve">Liu, X., Yang, Y., Zong, H., et al. (2024). Core reference ontology for individualized exercise prescription. Scientific Data, 11. doi:10.1038/s41597-024-04217-9</w:t>
       </w:r>
     </w:p>
     <w:p>
@@ -4957,7 +7490,7 @@
           <w:sz w:val="19"/>
           <w:szCs w:val="19"/>
         </w:rPr>
-        <w:t xml:space="preserve">Kinetic Human Movement Ontology: a semantic terminology model to symbolically represent physiological movement. (2026). Scientific Data. doi:10.1038/s41597-026-06984-z.</w:t>
+        <w:t xml:space="preserve">Kinetic human movement ontology: a semantic terminology model to symbolically represent physiological movement. (2026). Scientific Data. doi:10.1038/s41597-026-06984-z</w:t>
       </w:r>
     </w:p>
     <w:p>
@@ -4972,7 +7505,7 @@
           <w:sz w:val="19"/>
           <w:szCs w:val="19"/>
         </w:rPr>
-        <w:t xml:space="preserve">Weininger, D. (1988). SMILES, a Chemical Language and Information System. Journal of Chemical Information and Computer Sciences, 28(1), 31–36.</w:t>
+        <w:t xml:space="preserve">Rosse, C., &amp; Mejino, J. L. V. (2003). A reference ontology for biomedical informatics: the Foundational Model of Anatomy. Journal of Biomedical Informatics, 36(6), 478-500. doi:10.1016/j.jbi.2003.11.007</w:t>
       </w:r>
     </w:p>
     <w:p>
@@ -4987,7 +7520,22 @@
           <w:sz w:val="19"/>
           <w:szCs w:val="19"/>
         </w:rPr>
-        <w:t xml:space="preserve">Heller, S. R., McNaught, A., Pletnev, I., Stein, S., &amp; Tchekhovskoi, D. (2015). InChI, the IUPAC International Chemical Identifier. Journal of Cheminformatics, 7, 23.</w:t>
+        <w:t xml:space="preserve">Weininger, D. (1988). SMILES, a chemical language and information system. Journal of Chemical Information and Computer Sciences, 28(1), 31-36. doi:10.1021/ci00057a005</w:t>
+      </w:r>
+    </w:p>
+    <w:p>
+      <w:pPr>
+        <w:spacing w:after="120" w:line="264"/>
+        <w:ind w:left="360" w:hanging="360"/>
+      </w:pPr>
+      <w:r>
+        <w:rPr>
+          <w:rFonts w:ascii="Georgia" w:cs="Georgia" w:eastAsia="Georgia" w:hAnsi="Georgia"/>
+          <w:color w:val="1a1a1a"/>
+          <w:sz w:val="19"/>
+          <w:szCs w:val="19"/>
+        </w:rPr>
+        <w:t xml:space="preserve">Heller, S. R., McNaught, A., Pletnev, I., Stein, S., &amp; Tchekhovskoi, D. (2015). InChI, the IUPAC International Chemical Identifier. Journal of Cheminformatics, 7, 23. doi:10.1186/s13321-015-0068-4</w:t>
       </w:r>
     </w:p>
     <w:p>

</xml_diff>

<commit_message>
OMEN whitepaper: consistency fixes
</commit_message>
<xml_diff>
--- a/papers/OMEN_whitepaper.docx
+++ b/papers/OMEN_whitepaper.docx
@@ -525,6 +525,66 @@
           <w:szCs w:val="20"/>
         </w:rPr>
         <w:t xml:space="preserve">     Data and Code Availability</w:t>
+      </w:r>
+    </w:p>
+    <w:p>
+      <w:pPr>
+        <w:spacing w:after="60"/>
+        <w:ind w:left="240"/>
+      </w:pPr>
+      <w:r>
+        <w:rPr>
+          <w:rFonts w:ascii="Calibri" w:cs="Calibri" w:eastAsia="Calibri" w:hAnsi="Calibri"/>
+          <w:color w:val="1a1a1a"/>
+          <w:sz w:val="20"/>
+          <w:szCs w:val="20"/>
+        </w:rPr>
+        <w:t xml:space="preserve">     Author Contributions</w:t>
+      </w:r>
+    </w:p>
+    <w:p>
+      <w:pPr>
+        <w:spacing w:after="60"/>
+        <w:ind w:left="240"/>
+      </w:pPr>
+      <w:r>
+        <w:rPr>
+          <w:rFonts w:ascii="Calibri" w:cs="Calibri" w:eastAsia="Calibri" w:hAnsi="Calibri"/>
+          <w:color w:val="1a1a1a"/>
+          <w:sz w:val="20"/>
+          <w:szCs w:val="20"/>
+        </w:rPr>
+        <w:t xml:space="preserve">     Use of Generative AI</w:t>
+      </w:r>
+    </w:p>
+    <w:p>
+      <w:pPr>
+        <w:spacing w:after="60"/>
+        <w:ind w:left="240"/>
+      </w:pPr>
+      <w:r>
+        <w:rPr>
+          <w:rFonts w:ascii="Calibri" w:cs="Calibri" w:eastAsia="Calibri" w:hAnsi="Calibri"/>
+          <w:color w:val="1a1a1a"/>
+          <w:sz w:val="20"/>
+          <w:szCs w:val="20"/>
+        </w:rPr>
+        <w:t xml:space="preserve">     Funding</w:t>
+      </w:r>
+    </w:p>
+    <w:p>
+      <w:pPr>
+        <w:spacing w:after="60"/>
+        <w:ind w:left="240"/>
+      </w:pPr>
+      <w:r>
+        <w:rPr>
+          <w:rFonts w:ascii="Calibri" w:cs="Calibri" w:eastAsia="Calibri" w:hAnsi="Calibri"/>
+          <w:color w:val="1a1a1a"/>
+          <w:sz w:val="20"/>
+          <w:szCs w:val="20"/>
+        </w:rPr>
+        <w:t xml:space="preserve">     Conflicts of Interest</w:t>
       </w:r>
     </w:p>
     <w:p>
@@ -4846,7 +4906,7 @@
           <w:sz w:val="21"/>
           <w:szCs w:val="21"/>
         </w:rPr>
-        <w:t xml:space="preserve"> For every named exercise, confirm name → record → key → name returns the original name, and that OMEN-C re-parses to the same record.</w:t>
+        <w:t xml:space="preserve"> For every named exercise, confirm that name → record → key → name returns the original name. (A parser that reads OMEN-C back into a record is not yet implemented; see Section 11.)</w:t>
       </w:r>
     </w:p>
     <w:p>
@@ -6182,7 +6242,59 @@
           <w:sz w:val="24"/>
           <w:szCs w:val="24"/>
         </w:rPr>
-        <w:t xml:space="preserve">9.4 Collision resistance and determinism</w:t>
+        <w:t xml:space="preserve">9.4 Round-trip fidelity</w:t>
+      </w:r>
+    </w:p>
+    <w:p>
+      <w:pPr>
+        <w:spacing w:after="140" w:line="276"/>
+        <w:jc w:val="both"/>
+      </w:pPr>
+      <w:r>
+        <w:rPr>
+          <w:rFonts w:ascii="Georgia" w:cs="Georgia" w:eastAsia="Georgia" w:hAnsi="Georgia"/>
+          <w:color w:val="1a1a1a"/>
+          <w:sz w:val="21"/>
+          <w:szCs w:val="21"/>
+        </w:rPr>
+        <w:t xml:space="preserve">Every curated display name in the alias table was resolved to its facet record, encoded to a key, and rendered back to a name. All </w:t>
+      </w:r>
+      <w:r>
+        <w:rPr>
+          <w:rFonts w:ascii="Georgia" w:cs="Georgia" w:eastAsia="Georgia" w:hAnsi="Georgia"/>
+          <w:b/>
+          <w:bCs/>
+          <w:color w:val="1a1a1a"/>
+          <w:sz w:val="21"/>
+          <w:szCs w:val="21"/>
+        </w:rPr>
+        <w:t xml:space="preserve">17 of 17</w:t>
+      </w:r>
+      <w:r>
+        <w:rPr>
+          <w:rFonts w:ascii="Georgia" w:cs="Georgia" w:eastAsia="Georgia" w:hAnsi="Georgia"/>
+          <w:color w:val="1a1a1a"/>
+          <w:sz w:val="21"/>
+          <w:szCs w:val="21"/>
+        </w:rPr>
+        <w:t xml:space="preserve"> returned the original name exactly, and re-encoding the same record reproduced the same key in every case. This is the weakest of the measures reported here, because the alias table is small and hand-built, and it will only become informative as the table grows. It is reported because Section 8 promises it.</w:t>
+      </w:r>
+    </w:p>
+    <w:p>
+      <w:pPr>
+        <w:pStyle w:val="Heading2"/>
+        <w:spacing w:after="100" w:before="220"/>
+      </w:pPr>
+      <w:r>
+        <w:rPr>
+          <w:rFonts w:ascii="Calibri" w:cs="Calibri" w:eastAsia="Calibri" w:hAnsi="Calibri"/>
+          <w:b/>
+          <w:bCs/>
+          <w:color w:val="1a1a1a"/>
+          <w:sz w:val="24"/>
+          <w:szCs w:val="24"/>
+        </w:rPr>
+        <w:t xml:space="preserve">9.5 Collision resistance and determinism</w:t>
       </w:r>
     </w:p>
     <w:p>
@@ -6579,7 +6691,7 @@
           <w:sz w:val="24"/>
           <w:szCs w:val="24"/>
         </w:rPr>
-        <w:t xml:space="preserve">9.5 Versioning demonstrated</w:t>
+        <w:t xml:space="preserve">9.6 Versioning demonstrated</w:t>
       </w:r>
     </w:p>
     <w:p>
@@ -6611,7 +6723,7 @@
           <w:sz w:val="24"/>
           <w:szCs w:val="24"/>
         </w:rPr>
-        <w:t xml:space="preserve">9.6 A crosswalk as the first usable artifact</w:t>
+        <w:t xml:space="preserve">9.7 A crosswalk as the first usable artifact</w:t>
       </w:r>
     </w:p>
     <w:p>
@@ -7061,6 +7173,36 @@
           <w:szCs w:val="21"/>
         </w:rPr>
         <w:t xml:space="preserve"> Records were mapped to facets by script rather than by expert annotators, which is a proxy for manual encoding and not a substitute for it. Two mitigations are released: the mapping heuristics are published so the figure can be reproduced and contested, and a fixed-seed 50-record sample with a comparison script is provided so a human encoder can measure how far the automated mapping departs from their judgement.</w:t>
+      </w:r>
+    </w:p>
+    <w:p>
+      <w:pPr>
+        <w:pStyle w:val="ListParagraph"/>
+        <w:numPr>
+          <w:ilvl w:val="0"/>
+          <w:numId w:val="1"/>
+        </w:numPr>
+        <w:spacing w:after="90" w:line="268"/>
+      </w:pPr>
+      <w:r>
+        <w:rPr>
+          <w:rFonts w:ascii="Georgia" w:cs="Georgia" w:eastAsia="Georgia" w:hAnsi="Georgia"/>
+          <w:b/>
+          <w:bCs/>
+          <w:color w:val="1a1a1a"/>
+          <w:sz w:val="21"/>
+          <w:szCs w:val="21"/>
+        </w:rPr>
+        <w:t xml:space="preserve">OMEN-C cannot yet be parsed back.</w:t>
+      </w:r>
+      <w:r>
+        <w:rPr>
+          <w:rFonts w:ascii="Georgia" w:cs="Georgia" w:eastAsia="Georgia" w:hAnsi="Georgia"/>
+          <w:color w:val="1a1a1a"/>
+          <w:sz w:val="21"/>
+          <w:szCs w:val="21"/>
+        </w:rPr>
+        <w:t xml:space="preserve"> The compact human form is currently write-only: the encoder emits it but provides no reader that recovers a facet record from it. Because OMEN-C omits defaulted facets, parsing it is well defined and simply not yet built. Until it is, round-trip guarantees hold for names and keys but not for the compact string.</w:t>
       </w:r>
     </w:p>
     <w:p>

</xml_diff>